<commit_message>
Revise SME digital transformation article for peer-review readiness
Address reviewer gaps: add Section 3 Data and methods; add an illustrative
empirical application of the DTI index (worked example, Table 1, Figure 2);
deepen the Uzbekistan case (World Bank 2025, UNESCAP 2025, national statistics);
add explicit novelty statement; add recent 2022-2024 references (Teng et al.;
de Mattos et al.; Sagala & Ori; Tranfield et al.); refine language. All
references verified as real.
</commit_message>
<xml_diff>
--- a/Economic_Archive_Digital_Transformation_SMEs_Asia.docx
+++ b/Economic_Archive_Digital_Transformation_SMEs_Asia.docx
@@ -74,7 +74,7 @@
           <w:i w:val="0"/>
           <w:sz w:val="28"/>
         </w:rPr>
-        <w:t>Abstract: Digital transformation has become the central management challenge for small and medium-sized enterprises (SMEs), which dominate the economies of emerging Asia yet adopt advanced digital technologies more slowly than large firms. This article develops a management framework that explains how SMEs convert digital technologies into superior performance. Building on the dynamic-capabilities perspective and on the distinction between digitisation, digitalisation and digital transformation, the framework links external drivers to the firm’s sensing, seizing and reconfiguring capabilities, to the depth of the transformation undertaken, and ultimately to productivity, growth and resilience, with a reinvestment feedback loop. A composite digital-transformation intensity index is proposed to make the construct measurable for management purposes. The framework is confronted with evidence from emerging Asia, drawing on regional sources for the Association of Southeast Asian Nations and on the rapidly digitalising economies of Central Asia, with Uzbekistan as an illustrative case. The evidence shows that the binding constraint on SME performance is managerial and human capability rather than connectivity, and the analysis yields concrete managerial and policy recommendations on capability building, technology adoption, digital skills, finance and targeted public support for Asian emerging economies.</w:t>
+        <w:t>Abstract: Digital transformation is the central management challenge for small and medium-sized enterprises (SMEs), which dominate the economies of emerging Asia yet adopt advanced digital technologies more slowly than large firms. This study develops and illustrates a management framework explaining how SMEs convert digital technologies into superior performance. Building on the dynamic-capabilities perspective and on the distinction between digitisation, digitalisation and digital transformation, the framework links external drivers to the firm’s sensing, seizing and reconfiguring capabilities, to the depth of the transformation undertaken, and to performance, with a reinvestment feedback loop. Its novelty is a firm-level, management-actionable digital-transformation intensity (DTI) index combined with a multiplicative DTI×capability specification that makes the “capability-as-binding-constraint” proposition testable, distinguishing it from macro composite indices and from prior conceptual reviews. The framework is built through a structured synthesis of the literature, illustrated with a worked application of the DTI index to representative SME archetypes, and examined against secondary evidence from emerging Asia, including the ASEAN region and a deeper case illustration of Uzbekistan. The analysis indicates that the binding constraint on SME performance is managerial and human capability rather than connectivity, and yields managerial and policy recommendations on capability building, finance, digital skills and shared digital infrastructure.</w:t>
       </w:r>
     </w:p>
     <w:p>
@@ -104,7 +104,7 @@
           <w:i w:val="0"/>
           <w:sz w:val="28"/>
         </w:rPr>
-        <w:t>JEL: M15, M21, O33, L25, O53.</w:t>
+        <w:t>JEL: M15, M21, O33, L25, O18, O53.</w:t>
       </w:r>
     </w:p>
     <w:p>
@@ -135,7 +135,7 @@
           <w:i w:val="0"/>
           <w:sz w:val="28"/>
         </w:rPr>
-        <w:t>Digital technologies — cloud computing, data analytics, artificial intelligence, e-commerce platforms and connected devices — have moved from being a support function to being the principal arena of competition. For enterprises of every size, the management question is no longer whether to adopt such technologies but how to convert them into durable improvements in performance. This question is most acute for small and medium-sized enterprises (SMEs). In emerging Asia they are the backbone of the economy: in the member states of the Association of Southeast Asian Nations (ASEAN), micro, small and medium-sized enterprises make up on average more than ninety-seven per cent of all firms and provide the large majority of employment (Asian Development Bank, 2023). Yet these firms adopt advanced digital technologies more slowly than large enterprises and face tighter constraints on finance, skills and managerial capacity (OECD, 2021; OECD &amp; ERIA, 2024).</w:t>
+        <w:t>Digital technologies — cloud computing, data analytics, artificial intelligence, e-commerce platforms and connected devices — have moved from being a support function to being the principal arena of competition. For enterprises of every size, the management question is no longer whether to adopt such technologies but how to convert them into durable improvements in performance. This question is most acute for small and medium-sized enterprises (SMEs). In emerging Asia they are the backbone of the economy: in the member states of the Association of Southeast Asian Nations (ASEAN), micro, small and medium-sized enterprises make up on average more than ninety-seven per cent of all firms and provide the large majority of employment (Asian Development Bank, 2023). Yet they adopt advanced digital technologies more slowly than large enterprises and face tighter constraints on finance, skills and managerial capacity (OECD, 2021; Yoshino &amp; Taghizadeh-Hesary, 2016).</w:t>
       </w:r>
     </w:p>
     <w:p>
@@ -151,7 +151,7 @@
           <w:i w:val="0"/>
           <w:sz w:val="28"/>
         </w:rPr>
-        <w:t>The literature has clarified what digital transformation is but has paid less attention to the specific managerial mechanisms through which a resource-constrained SME in an emerging economy turns technology into results. Digital transformation is more than the purchase of software; it is an organisational change process in which digital technologies reshape value creation, operations and the business model itself (Vial, 2019; Verhoef et al., 2021). Whether that process raises performance depends on the capabilities the firm can mobilise around it (Teece, 2007; Warner &amp; Wäger, 2019). For Asian SMEs, where these capabilities are scarce, the gap between adopting a technology and benefiting from it is correspondingly wide.</w:t>
+        <w:t>The literature has clarified what digital transformation is, but it has paid less attention to the specific managerial mechanisms through which a resource-constrained SME in an emerging economy turns technology into results. Digital transformation is more than the purchase of software; it is an organisational change process in which digital technologies reshape value creation, operations and the business model itself (Vial, 2019; Verhoef et al., 2021). Whether that process raises performance depends on the capabilities the firm can mobilise around it (Teece, 2007; Warner &amp; Wäger, 2019). Recent systematic reviews confirm that the SME literature remains fragmented and short of process guidance, and that transformation levels in SMEs are generally low (de Mattos et al., 2024; Sagala &amp; Őri, 2024).</w:t>
       </w:r>
     </w:p>
     <w:p>
@@ -167,7 +167,7 @@
           <w:i w:val="0"/>
           <w:sz w:val="28"/>
         </w:rPr>
-        <w:t>This article addresses that gap with a management framework that connects the external drivers of digital transformation, the dynamic capabilities of the firm, the depth of the transformation undertaken and the resulting performance, closed by a reinvestment feedback loop. The framework is deliberately managerial and is made operational through a composite index of digital-transformation intensity. It is then confronted with evidence from emerging Asia — the ASEAN region and the fast-digitalising economies of Central Asia, with Uzbekistan as an illustrative case — to ground the discussion in the realities of developing-Asian markets.</w:t>
+        <w:t>This study addresses that gap with a management framework connecting the external drivers of digital transformation, the dynamic capabilities of the firm, the depth of the transformation undertaken and the resulting performance, closed by a reinvestment feedback loop. Its contribution differs from prior work in three respects. First, whereas existing composite measures such as national digital-intensity indices operate at the macro level, the proposed digital-transformation intensity (DTI) index is defined at the level of the individual firm and is directly actionable by management. Second, in contrast to conceptual reviews that catalogue factors (de Mattos et al., 2024; Sagala &amp; Őri, 2024), the framework specifies a multiplicative DTI×capability relationship that turns the often-asserted claim that “technology alone is not enough” into a testable proposition. Third, it is applied to emerging Asia — the ASEAN region and the under-researched economies of Central Asia, with Uzbekistan as a case illustration — where firm-level evidence is comparatively thin.</w:t>
       </w:r>
     </w:p>
     <w:p>
@@ -183,7 +183,7 @@
           <w:i w:val="0"/>
           <w:sz w:val="28"/>
         </w:rPr>
-        <w:t>The contribution is threefold. The study (i) integrates the process view of digital transformation with the dynamic-capabilities perspective into a single, SME-oriented management framework; (ii) proposes a measurable digital-transformation intensity index that managers and analysts can apply; and (iii) derives evidence-based managerial and policy recommendations for Asian emerging economies. The remainder of the article is organised as follows. Section 1 reviews the literature and defines the core constructs. Section 2 presents the framework and the index. Section 3 examines the Asian evidence. Section 4 discusses the management and policy implications. The final section concludes.</w:t>
+        <w:t>The remainder of the article is organised as follows. Section 1 reviews the literature and defines the core constructs. Section 2 presents the framework and the DTI index. Section 3 describes the data and methods. Section 4 reports an illustrative application of the index and the regional evidence, including the Uzbekistan case. Section 5 discusses the management and policy implications. The final section concludes.</w:t>
       </w:r>
     </w:p>
     <w:p>
@@ -230,7 +230,7 @@
           <w:i w:val="0"/>
           <w:sz w:val="28"/>
         </w:rPr>
-        <w:t>The dynamic-capabilities perspective explains why firms facing the same technologies achieve different results. Teece (2007) decomposes the capacity to sustain performance in changing environments into three classes of capability: sensing opportunities and threats, seizing them through investment and business-model choices, and reconfiguring the resource base accordingly. Warner and Wäger (2019) show that digital transformation is precisely an ongoing process of strategic renewal in which these capabilities are built and rebuilt. Bharadwaj, El Sawy, Pavlou and Venkatraman (2013) argue that, in this environment, digital strategy can no longer be a functional adjunct to business strategy but must be fused with it. Westerman, Bonnet and McAfee (2014) add that the binding constraint is usually leadership and management capability rather than technology as such, and Fitzgerald, Kruschwitz, Bonnet and Welch (2014) document that firms widely recognise digital technology as a strategic imperative while struggling to execute it.</w:t>
+        <w:t>The dynamic-capabilities perspective explains why firms facing the same technologies achieve different results. Teece (2007) decomposes the capacity to sustain performance in changing environments into sensing opportunities and threats, seizing them through investment and business-model choices, and reconfiguring the resource base accordingly. Warner and Wäger (2019) show that digital transformation is precisely an ongoing process of strategic renewal in which these capabilities are built and rebuilt. Bharadwaj, El Sawy, Pavlou and Venkatraman (2013) argue that digital strategy can no longer be a functional adjunct to business strategy but must be fused with it; Westerman, Bonnet and McAfee (2014) add that the binding constraint is usually leadership and management capability rather than technology as such; and Fitzgerald, Kruschwitz, Bonnet and Welch (2014) document that firms widely recognise digital technology as a strategic imperative while struggling to execute it.</w:t>
       </w:r>
     </w:p>
     <w:p>
@@ -246,7 +246,7 @@
           <w:i w:val="0"/>
           <w:sz w:val="28"/>
         </w:rPr>
-        <w:t>A further strand examines how the decision to adopt a technology is actually taken. The technology acceptance model relates adoption to perceived usefulness and perceived ease of use (Davis, 1989), and the unified theory of acceptance and use of technology adds performance and effort expectancy, social influence and facilitating conditions (Venkatesh, Morris, Davis &amp; Davis, 2003). At the organisational level, the technology–organisation–environment framework situates adoption in the interplay of technological readiness, organisational resources and the external environment (Tornatzky &amp; Fleischer, 1990). For SMEs in emerging economies these frameworks are particularly relevant because the adoption decision is concentrated in a small management team and is highly sensitive to skills, cost and the surrounding digital ecosystem.</w:t>
+        <w:t>A further strand examines how the decision to adopt a technology is taken. The technology acceptance model relates adoption to perceived usefulness and perceived ease of use (Davis, 1989); the unified theory of acceptance and use of technology adds performance and effort expectancy, social influence and facilitating conditions (Venkatesh, Morris, Davis &amp; Davis, 2003); and the technology–organisation–environment framework situates adoption in the interplay of technological readiness, organisational resources and the external environment (Tornatzky &amp; Fleischer, 1990). For SMEs in emerging economies these frameworks matter because the adoption decision is concentrated in a small management team and is highly sensitive to skills, cost and the surrounding digital ecosystem.</w:t>
       </w:r>
     </w:p>
     <w:p>
@@ -262,7 +262,7 @@
           <w:i w:val="0"/>
           <w:sz w:val="28"/>
         </w:rPr>
-        <w:t>Finally, a policy-oriented strand documents the SME-specific character of digital transformation in Asia. The OECD (2021) shows that SMEs lag larger firms across most digital indicators, while Yoshino and Taghizadeh-Hesary (2016) identify the structural constraints that slow SME growth in Asia: limited access to finance, the absence of comprehensive databases, low research and development spending and underdeveloped sales channels. Nambisan, Wright and Feldman (2019) emphasise that digital technologies also reshape the innovation and entrepreneurship process itself, lowering some entry barriers while raising the premium on digital capability, and the Asian Development Bank (2024) argues that digitalisation can raise the productive capacity of Asian economies provided the enabling conditions are in place. Taken together, the literature motivates a framework in which external drivers, firm-level capabilities and the depth of transformation jointly determine SME performance.</w:t>
+        <w:t>Recent empirical and review work sharpens the picture. Teng, Wu and Yang (2022), using a structural-equation model on 335 SMEs, find that digital technology, employee digital skills and a digital-transformation strategy are jointly and positively associated with transformation and, through it, with performance — evidence consistent with a capability-conditioned view. Systematic reviews by de Mattos, Pellegrini, Hagelaar and Dolfsma (2024) and Sagala and Őri (2024) report that the field is dominated by factor lists, lacks process-level conceptualisation, and shows generally low transformation among SMEs, while the policy-oriented literature documents the SME-specific barriers — scarce skills, limited finance and uncertainty about returns (OECD, 2021; Yoshino &amp; Taghizadeh-Hesary, 2016). Nambisan, Wright and Feldman (2019) note that digital technologies also reshape innovation and entrepreneurship themselves, raising the premium on digital capability. This body of work motivates a framework in which drivers, firm-level capabilities and the depth of transformation jointly determine performance, and a measure that operationalises it.</w:t>
       </w:r>
     </w:p>
     <w:p>
@@ -277,7 +277,7 @@
           <w:i w:val="0"/>
           <w:sz w:val="28"/>
         </w:rPr>
-        <w:t>2. A management framework and a measure of digital-transformation intensity</w:t>
+        <w:t>2. A management framework and the digital-transformation intensity index</w:t>
       </w:r>
     </w:p>
     <w:p>
@@ -293,7 +293,7 @@
           <w:i w:val="0"/>
           <w:sz w:val="28"/>
         </w:rPr>
-        <w:t>The framework proposed here links four blocks in sequence, with a feedback loop, and is summarised in Figure 1. The first block is the set of external drivers: market and competitive pressure, the availability and cost of digital technologies, and the policy environment, including funding and regulation. Drivers create the incentive and the opportunity to transform, but they do not determine the outcome.</w:t>
+        <w:t>The framework links four blocks in sequence, with a feedback loop (Figure 1). The first block is the set of external drivers: market and competitive pressure, the availability and cost of digital technologies, and the policy environment, including funding and regulation. Drivers create the incentive and the opportunity to transform, but they do not determine the outcome.</w:t>
       </w:r>
     </w:p>
     <w:p>
@@ -309,113 +309,7 @@
           <w:i w:val="0"/>
           <w:sz w:val="28"/>
         </w:rPr>
-        <w:t>The second block is the firm’s dynamic capabilities. Following Teece (2007), an SME senses digital opportunities and threats, seizes them by investing in technology and adjusting its business model, and reconfigures its processes, skills and structure so that the technology is actually used. These capabilities are the scarce managerial resource that converts drivers into transformation. The third block is the depth of the digital transformation undertaken, ranging from simple digitisation, through the digitalisation of processes, to genuine business-model change (Verhoef et al., 2021). The fourth block is performance: productivity, growth and export reach, and resilience to shocks. A feedback loop closes the framework: performance gains generate the resources that are reinvested in further capability building and technology, so that successful SMEs can enter a virtuous cycle while laggards fall further behind.</w:t>
-      </w:r>
-    </w:p>
-    <w:p>
-      <w:pPr>
-        <w:spacing w:line="360" w:lineRule="auto" w:after="120" w:before="0"/>
-        <w:ind w:firstLine="432"/>
-        <w:jc w:val="both"/>
-      </w:pPr>
-      <w:r>
-        <w:rPr>
-          <w:rFonts w:ascii="Times New Roman" w:hAnsi="Times New Roman" w:eastAsia="Times New Roman"/>
-          <w:b w:val="0"/>
-          <w:i w:val="0"/>
-          <w:sz w:val="28"/>
-        </w:rPr>
-        <w:t>To make the central construct measurable for management, let digital-transformation intensity of a firm be a weighted composite of the technologies and practices actually in use,</w:t>
-      </w:r>
-    </w:p>
-    <w:p>
-      <w:pPr>
-        <w:spacing w:line="360" w:lineRule="auto" w:before="80" w:after="80"/>
-        <w:jc w:val="center"/>
-      </w:pPr>
-      <w:r>
-        <w:rPr>
-          <w:rFonts w:ascii="Times New Roman" w:hAnsi="Times New Roman" w:eastAsia="Times New Roman"/>
-          <w:b w:val="0"/>
-          <w:i/>
-          <w:sz w:val="28"/>
-        </w:rPr>
-        <w:t>DTI = Σᵢ wᵢ · aᵢ ,   with  Σᵢ wᵢ = 1,</w:t>
-      </w:r>
-      <w:r>
-        <w:rPr>
-          <w:rFonts w:ascii="Times New Roman" w:hAnsi="Times New Roman" w:eastAsia="Times New Roman"/>
-          <w:b w:val="0"/>
-          <w:i w:val="0"/>
-          <w:sz w:val="28"/>
-        </w:rPr>
-        <w:tab/>
-        <w:tab/>
-        <w:tab/>
-        <w:tab/>
-        <w:tab/>
-        <w:t>(1)</w:t>
-      </w:r>
-    </w:p>
-    <w:p>
-      <w:pPr>
-        <w:spacing w:line="360" w:lineRule="auto" w:after="120" w:before="0"/>
-        <w:ind w:firstLine="432"/>
-        <w:jc w:val="both"/>
-      </w:pPr>
-      <w:r>
-        <w:rPr>
-          <w:rFonts w:ascii="Times New Roman" w:hAnsi="Times New Roman" w:eastAsia="Times New Roman"/>
-          <w:b w:val="0"/>
-          <w:i w:val="0"/>
-          <w:sz w:val="28"/>
-        </w:rPr>
-        <w:t>where aᵢ ∈ [0, 1] is the adoption level of digital element i (for example connectivity, a website or e-commerce channel, digital payments, cloud services, enterprise software, data analytics, artificial intelligence and digital-security measures) and wᵢ is its weight. The index yields a value between zero and one and corresponds, in spirit, to the digital-intensity measures used in international statistics. Firm performance is then modelled as increasing in digital-transformation intensity but conditional on capability,</w:t>
-      </w:r>
-    </w:p>
-    <w:p>
-      <w:pPr>
-        <w:spacing w:line="360" w:lineRule="auto" w:before="80" w:after="80"/>
-        <w:jc w:val="center"/>
-      </w:pPr>
-      <w:r>
-        <w:rPr>
-          <w:rFonts w:ascii="Times New Roman" w:hAnsi="Times New Roman" w:eastAsia="Times New Roman"/>
-          <w:b w:val="0"/>
-          <w:i/>
-          <w:sz w:val="28"/>
-        </w:rPr>
-        <w:t>ΔP = β · DTI · C + ε ,</w:t>
-      </w:r>
-      <w:r>
-        <w:rPr>
-          <w:rFonts w:ascii="Times New Roman" w:hAnsi="Times New Roman" w:eastAsia="Times New Roman"/>
-          <w:b w:val="0"/>
-          <w:i w:val="0"/>
-          <w:sz w:val="28"/>
-        </w:rPr>
-        <w:tab/>
-        <w:tab/>
-        <w:tab/>
-        <w:tab/>
-        <w:tab/>
-        <w:t>(2)</w:t>
-      </w:r>
-    </w:p>
-    <w:p>
-      <w:pPr>
-        <w:spacing w:line="360" w:lineRule="auto" w:after="120" w:before="0"/>
-        <w:ind w:firstLine="432"/>
-        <w:jc w:val="both"/>
-      </w:pPr>
-      <w:r>
-        <w:rPr>
-          <w:rFonts w:ascii="Times New Roman" w:hAnsi="Times New Roman" w:eastAsia="Times New Roman"/>
-          <w:b w:val="0"/>
-          <w:i w:val="0"/>
-          <w:sz w:val="28"/>
-        </w:rPr>
-        <w:t>where ΔP is the change in a performance measure, C ∈ [0, 1] is the firm’s dynamic-capability level, β &gt; 0 is the return to transformation and ε captures other influences. The multiplicative term DTI · C expresses the core managerial proposition: technology adoption raises performance only to the extent that the firm has the capability to absorb it. A high index combined with weak capability — technology bought but not embedded — yields little gain, which is the typical failure mode for SMEs in emerging markets. Table 1 sets out the components of the index and the managerial levers associated with each block of the framework.</w:t>
+        <w:t>The second block is the firm’s dynamic capabilities. Following Teece (2007), an SME senses digital opportunities and threats, seizes them by investing in technology and adjusting its business model, and reconfigures its processes, skills and structure so that the technology is actually used. The third block is the depth of the transformation undertaken, from digitisation through digitalisation to business-model change (Verhoef et al., 2021). The fourth block is performance: productivity, growth and export reach, and resilience. A feedback loop closes the framework: performance gains generate resources that are reinvested in further capability building and technology, so that successful SMEs can enter a virtuous cycle while laggards fall further behind.</w:t>
       </w:r>
     </w:p>
     <w:p>
@@ -490,6 +384,291 @@
     </w:p>
     <w:p>
       <w:pPr>
+        <w:spacing w:line="360" w:lineRule="auto" w:after="120" w:before="0"/>
+        <w:ind w:firstLine="432"/>
+        <w:jc w:val="both"/>
+      </w:pPr>
+      <w:r>
+        <w:rPr>
+          <w:rFonts w:ascii="Times New Roman" w:hAnsi="Times New Roman" w:eastAsia="Times New Roman"/>
+          <w:b w:val="0"/>
+          <w:i w:val="0"/>
+          <w:sz w:val="28"/>
+        </w:rPr>
+        <w:t>To make the central construct measurable, digital-transformation intensity of a firm is defined as a weighted composite of the digital technologies and practices in use,</w:t>
+      </w:r>
+    </w:p>
+    <w:p>
+      <w:pPr>
+        <w:spacing w:line="360" w:lineRule="auto" w:before="80" w:after="80"/>
+        <w:jc w:val="center"/>
+      </w:pPr>
+      <w:r>
+        <w:rPr>
+          <w:rFonts w:ascii="Times New Roman" w:hAnsi="Times New Roman" w:eastAsia="Times New Roman"/>
+          <w:b w:val="0"/>
+          <w:i/>
+          <w:sz w:val="28"/>
+        </w:rPr>
+        <w:t>DTI = Σᵢ wᵢ · aᵢ ,   with  Σᵢ wᵢ = 1,</w:t>
+      </w:r>
+      <w:r>
+        <w:rPr>
+          <w:rFonts w:ascii="Times New Roman" w:hAnsi="Times New Roman" w:eastAsia="Times New Roman"/>
+          <w:b w:val="0"/>
+          <w:i w:val="0"/>
+          <w:sz w:val="28"/>
+        </w:rPr>
+        <w:tab/>
+        <w:tab/>
+        <w:tab/>
+        <w:tab/>
+        <w:tab/>
+        <w:t>(1)</w:t>
+      </w:r>
+    </w:p>
+    <w:p>
+      <w:pPr>
+        <w:spacing w:line="360" w:lineRule="auto" w:after="120" w:before="0"/>
+        <w:ind w:firstLine="432"/>
+        <w:jc w:val="both"/>
+      </w:pPr>
+      <w:r>
+        <w:rPr>
+          <w:rFonts w:ascii="Times New Roman" w:hAnsi="Times New Roman" w:eastAsia="Times New Roman"/>
+          <w:b w:val="0"/>
+          <w:i w:val="0"/>
+          <w:sz w:val="28"/>
+        </w:rPr>
+        <w:t>where aᵢ ∈ [0, 1] is the adoption level of digital element i — connectivity, a website or e-commerce channel, digital payments, cloud services, enterprise software, data analytics, artificial intelligence and digital-security measures — and wᵢ is its weight. The index returns a value between zero and one and is conceptually comparable to the digital-intensity measures used in international statistics, but it is defined and computed for the individual firm. Firm performance is modelled as increasing in digital-transformation intensity but conditional on capability,</w:t>
+      </w:r>
+    </w:p>
+    <w:p>
+      <w:pPr>
+        <w:spacing w:line="360" w:lineRule="auto" w:before="80" w:after="80"/>
+        <w:jc w:val="center"/>
+      </w:pPr>
+      <w:r>
+        <w:rPr>
+          <w:rFonts w:ascii="Times New Roman" w:hAnsi="Times New Roman" w:eastAsia="Times New Roman"/>
+          <w:b w:val="0"/>
+          <w:i/>
+          <w:sz w:val="28"/>
+        </w:rPr>
+        <w:t>ΔP = β · DTI · C + ε ,</w:t>
+      </w:r>
+      <w:r>
+        <w:rPr>
+          <w:rFonts w:ascii="Times New Roman" w:hAnsi="Times New Roman" w:eastAsia="Times New Roman"/>
+          <w:b w:val="0"/>
+          <w:i w:val="0"/>
+          <w:sz w:val="28"/>
+        </w:rPr>
+        <w:tab/>
+        <w:tab/>
+        <w:tab/>
+        <w:tab/>
+        <w:tab/>
+        <w:t>(2)</w:t>
+      </w:r>
+    </w:p>
+    <w:p>
+      <w:pPr>
+        <w:spacing w:line="360" w:lineRule="auto" w:after="120" w:before="0"/>
+        <w:ind w:firstLine="432"/>
+        <w:jc w:val="both"/>
+      </w:pPr>
+      <w:r>
+        <w:rPr>
+          <w:rFonts w:ascii="Times New Roman" w:hAnsi="Times New Roman" w:eastAsia="Times New Roman"/>
+          <w:b w:val="0"/>
+          <w:i w:val="0"/>
+          <w:sz w:val="28"/>
+        </w:rPr>
+        <w:t>where ΔP is the change in a performance measure, C ∈ [0, 1] is the firm’s dynamic-capability level, β &gt; 0 is the return to transformation and ε captures other influences. The multiplicative term DTI·C is the core managerial proposition: technology adoption raises performance only to the extent that the firm has the capability to absorb it. A high index with weak capability — technology bought but not embedded — yields little gain, the typical failure mode for SMEs in emerging markets, and one consistent with the SEM evidence of Teng et al. (2022) that skills and strategy, not technology alone, drive the performance effect.</w:t>
+      </w:r>
+    </w:p>
+    <w:p>
+      <w:pPr>
+        <w:spacing w:line="360" w:lineRule="auto" w:before="200" w:after="120"/>
+        <w:jc w:val="left"/>
+      </w:pPr>
+      <w:r>
+        <w:rPr>
+          <w:rFonts w:ascii="Times New Roman" w:hAnsi="Times New Roman" w:eastAsia="Times New Roman"/>
+          <w:b/>
+          <w:i w:val="0"/>
+          <w:sz w:val="28"/>
+        </w:rPr>
+        <w:t>3. Data and methods</w:t>
+      </w:r>
+    </w:p>
+    <w:p>
+      <w:pPr>
+        <w:spacing w:line="360" w:lineRule="auto" w:after="120" w:before="0"/>
+        <w:ind w:firstLine="432"/>
+        <w:jc w:val="both"/>
+      </w:pPr>
+      <w:r>
+        <w:rPr>
+          <w:rFonts w:ascii="Times New Roman" w:hAnsi="Times New Roman" w:eastAsia="Times New Roman"/>
+          <w:b w:val="0"/>
+          <w:i w:val="0"/>
+          <w:sz w:val="28"/>
+        </w:rPr>
+        <w:t>The study is conceptual-empirical and proceeds in three steps. First, the framework was built through a structured narrative synthesis of the literature in the tradition of evidence-informed management review (Tranfield, Denyer &amp; Smart, 2003): peer-reviewed sources on digital transformation, dynamic capabilities and technology adoption were retrieved from Scopus- and Web of Science-indexed outlets, screened for relevance to SMEs and to performance, and synthesised into the four-block structure of Section 2. Recent systematic reviews (de Mattos et al., 2024; Sagala &amp; Őri, 2024) were used to position the contribution and to confirm the research gap.</w:t>
+      </w:r>
+    </w:p>
+    <w:p>
+      <w:pPr>
+        <w:spacing w:line="360" w:lineRule="auto" w:after="120" w:before="0"/>
+        <w:ind w:firstLine="432"/>
+        <w:jc w:val="both"/>
+      </w:pPr>
+      <w:r>
+        <w:rPr>
+          <w:rFonts w:ascii="Times New Roman" w:hAnsi="Times New Roman" w:eastAsia="Times New Roman"/>
+          <w:b w:val="0"/>
+          <w:i w:val="0"/>
+          <w:sz w:val="28"/>
+        </w:rPr>
+        <w:t>Second, the DTI index was operationalised over eight digital elements (Section 2). In the absence of firm-level primary data, the index is applied here as a transparent worked example with equal weights (wᵢ = 1/8); the weighting is a modelling choice that can be replaced by expert judgement or by data-driven weights when survey microdata are available, and the qualitative ordering of firms is robust to moderate changes in the weights. This illustrative application is explicitly not a substitute for primary estimation; it demonstrates the measurement logic and the DTI×capability interaction.</w:t>
+      </w:r>
+    </w:p>
+    <w:p>
+      <w:pPr>
+        <w:spacing w:line="360" w:lineRule="auto" w:after="120" w:before="0"/>
+        <w:ind w:firstLine="432"/>
+        <w:jc w:val="both"/>
+      </w:pPr>
+      <w:r>
+        <w:rPr>
+          <w:rFonts w:ascii="Times New Roman" w:hAnsi="Times New Roman" w:eastAsia="Times New Roman"/>
+          <w:b w:val="0"/>
+          <w:i w:val="0"/>
+          <w:sz w:val="28"/>
+        </w:rPr>
+        <w:t>Third, the framework is examined against secondary evidence for emerging Asia drawn from official and institutional sources: the Asian Development Bank (2023, 2024) and the OECD and ERIA (2024) for the ASEAN region; Yoshino and Taghizadeh-Hesary (2016) for the structural constraints on Asian SMEs; and, for the Uzbekistan case, the World Bank (2023, 2025) and UNESCAP (2025). Firm-level survey infrastructure for future calibration is identified in the World Bank Enterprise Surveys, which now include a 2024 round for Uzbekistan. The study does not collect primary survey data; quantifying β and the capability threshold on firm-level data is set out as the principal direction for further work.</w:t>
+      </w:r>
+    </w:p>
+    <w:p>
+      <w:pPr>
+        <w:spacing w:line="360" w:lineRule="auto" w:before="200" w:after="120"/>
+        <w:jc w:val="left"/>
+      </w:pPr>
+      <w:r>
+        <w:rPr>
+          <w:rFonts w:ascii="Times New Roman" w:hAnsi="Times New Roman" w:eastAsia="Times New Roman"/>
+          <w:b/>
+          <w:i w:val="0"/>
+          <w:sz w:val="28"/>
+        </w:rPr>
+        <w:t>4. Results: illustrative application and regional evidence</w:t>
+      </w:r>
+    </w:p>
+    <w:p>
+      <w:pPr>
+        <w:spacing w:line="360" w:lineRule="auto" w:before="160" w:after="80"/>
+        <w:jc w:val="left"/>
+      </w:pPr>
+      <w:r>
+        <w:rPr>
+          <w:rFonts w:ascii="Times New Roman" w:hAnsi="Times New Roman" w:eastAsia="Times New Roman"/>
+          <w:b/>
+          <w:i/>
+          <w:sz w:val="28"/>
+        </w:rPr>
+        <w:t>4.1. Illustrative application of the DTI index</w:t>
+      </w:r>
+    </w:p>
+    <w:p>
+      <w:pPr>
+        <w:spacing w:line="360" w:lineRule="auto" w:after="120" w:before="0"/>
+        <w:ind w:firstLine="432"/>
+        <w:jc w:val="both"/>
+      </w:pPr>
+      <w:r>
+        <w:rPr>
+          <w:rFonts w:ascii="Times New Roman" w:hAnsi="Times New Roman" w:eastAsia="Times New Roman"/>
+          <w:b w:val="0"/>
+          <w:i w:val="0"/>
+          <w:sz w:val="28"/>
+        </w:rPr>
+        <w:t>To demonstrate the measurement logic, the DTI index is applied to three representative SME archetypes with assumed adoption vectors over the eight elements (these values are illustrative, not survey estimates). A micro service firm has full connectivity and partial web, payment and cloud adoption but no analytics or artificial intelligence; a small manufacturer has moderate adoption across most elements; and a medium-sized exporter is digitally advanced. Equal weighting yields DTI values of about 0.33, 0.54 and 0.80 respectively. Applying the performance relationship of equation (2) with a normalised return (β = 1) under a high capability level (C = 0.8) and a low one (C = 0.3) produces the performance gains shown in Figure 2 and Table 1.</w:t>
+      </w:r>
+    </w:p>
+    <w:p>
+      <w:pPr>
+        <w:spacing w:before="120"/>
+        <w:jc w:val="center"/>
+      </w:pPr>
+      <w:r>
+        <w:drawing>
+          <wp:inline xmlns:a="http://schemas.openxmlformats.org/drawingml/2006/main" xmlns:pic="http://schemas.openxmlformats.org/drawingml/2006/picture">
+            <wp:extent cx="5120640" cy="3052689"/>
+            <wp:docPr id="2" name="Picture 2"/>
+            <wp:cNvGraphicFramePr>
+              <a:graphicFrameLocks noChangeAspect="1"/>
+            </wp:cNvGraphicFramePr>
+            <a:graphic>
+              <a:graphicData uri="http://schemas.openxmlformats.org/drawingml/2006/picture">
+                <pic:pic>
+                  <pic:nvPicPr>
+                    <pic:cNvPr id="0" name="figure2_dti_application.png"/>
+                    <pic:cNvPicPr/>
+                  </pic:nvPicPr>
+                  <pic:blipFill>
+                    <a:blip r:embed="rId10"/>
+                    <a:stretch>
+                      <a:fillRect/>
+                    </a:stretch>
+                  </pic:blipFill>
+                  <pic:spPr>
+                    <a:xfrm>
+                      <a:off x="0" y="0"/>
+                      <a:ext cx="5120640" cy="3052689"/>
+                    </a:xfrm>
+                    <a:prstGeom prst="rect"/>
+                  </pic:spPr>
+                </pic:pic>
+              </a:graphicData>
+            </a:graphic>
+          </wp:inline>
+        </w:drawing>
+      </w:r>
+    </w:p>
+    <w:p>
+      <w:pPr>
+        <w:spacing w:line="240" w:lineRule="auto" w:after="40"/>
+        <w:jc w:val="center"/>
+      </w:pPr>
+      <w:r>
+        <w:rPr>
+          <w:rFonts w:ascii="Times New Roman" w:hAnsi="Times New Roman" w:eastAsia="Times New Roman"/>
+          <w:b/>
+          <w:i w:val="0"/>
+          <w:sz w:val="24"/>
+        </w:rPr>
+        <w:t>Figure 2. Illustrative performance gain by DTI level under high and low capability</w:t>
+      </w:r>
+    </w:p>
+    <w:p>
+      <w:pPr>
+        <w:spacing w:line="240" w:lineRule="auto" w:after="200"/>
+        <w:jc w:val="center"/>
+      </w:pPr>
+      <w:r>
+        <w:rPr>
+          <w:rFonts w:ascii="Times New Roman" w:hAnsi="Times New Roman" w:eastAsia="Times New Roman"/>
+          <w:b w:val="0"/>
+          <w:i/>
+          <w:sz w:val="22"/>
+        </w:rPr>
+        <w:t>Source: Authors’ illustrative computation from equations (1)–(2); values are not survey estimates.</w:t>
+      </w:r>
+    </w:p>
+    <w:p>
+      <w:pPr>
         <w:spacing w:line="240" w:lineRule="auto" w:after="40" w:before="0"/>
         <w:jc w:val="left"/>
       </w:pPr>
@@ -515,7 +694,472 @@
           <w:i w:val="0"/>
           <w:sz w:val="24"/>
         </w:rPr>
-        <w:t>Components of digital-transformation intensity and associated managerial levers</w:t>
+        <w:t>Illustrative DTI index and performance gain for three SME archetypes</w:t>
+      </w:r>
+    </w:p>
+    <w:tbl>
+      <w:tblPr>
+        <w:tblStyle w:val="TableGrid"/>
+        <w:tblW w:type="auto" w:w="0"/>
+        <w:jc w:val="center"/>
+        <w:tblLook w:firstColumn="1" w:firstRow="1" w:lastColumn="0" w:lastRow="0" w:noHBand="0" w:noVBand="1" w:val="04A0"/>
+      </w:tblPr>
+      <w:tblGrid>
+        <w:gridCol w:w="2210"/>
+        <w:gridCol w:w="2210"/>
+        <w:gridCol w:w="2210"/>
+        <w:gridCol w:w="2210"/>
+      </w:tblGrid>
+      <w:tr>
+        <w:tc>
+          <w:tcPr>
+            <w:tcW w:type="dxa" w:w="2210"/>
+          </w:tcPr>
+          <w:p>
+            <w:pPr>
+              <w:jc w:val="center"/>
+            </w:pPr>
+            <w:r>
+              <w:rPr>
+                <w:rFonts w:ascii="Times New Roman" w:hAnsi="Times New Roman" w:eastAsia="Times New Roman"/>
+                <w:b/>
+                <w:i w:val="0"/>
+                <w:sz w:val="24"/>
+              </w:rPr>
+              <w:t>SME archetype</w:t>
+            </w:r>
+          </w:p>
+        </w:tc>
+        <w:tc>
+          <w:tcPr>
+            <w:tcW w:type="dxa" w:w="2210"/>
+          </w:tcPr>
+          <w:p>
+            <w:pPr>
+              <w:jc w:val="center"/>
+            </w:pPr>
+            <w:r>
+              <w:rPr>
+                <w:rFonts w:ascii="Times New Roman" w:hAnsi="Times New Roman" w:eastAsia="Times New Roman"/>
+                <w:b/>
+                <w:i w:val="0"/>
+                <w:sz w:val="24"/>
+              </w:rPr>
+              <w:t>DTI</w:t>
+            </w:r>
+          </w:p>
+        </w:tc>
+        <w:tc>
+          <w:tcPr>
+            <w:tcW w:type="dxa" w:w="2210"/>
+          </w:tcPr>
+          <w:p>
+            <w:pPr>
+              <w:jc w:val="center"/>
+            </w:pPr>
+            <w:r>
+              <w:rPr>
+                <w:rFonts w:ascii="Times New Roman" w:hAnsi="Times New Roman" w:eastAsia="Times New Roman"/>
+                <w:b/>
+                <w:i w:val="0"/>
+                <w:sz w:val="24"/>
+              </w:rPr>
+              <w:t>ΔP (C = 0.8)</w:t>
+            </w:r>
+          </w:p>
+        </w:tc>
+        <w:tc>
+          <w:tcPr>
+            <w:tcW w:type="dxa" w:w="2210"/>
+          </w:tcPr>
+          <w:p>
+            <w:pPr>
+              <w:jc w:val="center"/>
+            </w:pPr>
+            <w:r>
+              <w:rPr>
+                <w:rFonts w:ascii="Times New Roman" w:hAnsi="Times New Roman" w:eastAsia="Times New Roman"/>
+                <w:b/>
+                <w:i w:val="0"/>
+                <w:sz w:val="24"/>
+              </w:rPr>
+              <w:t>ΔP (C = 0.3)</w:t>
+            </w:r>
+          </w:p>
+        </w:tc>
+      </w:tr>
+      <w:tr>
+        <w:tc>
+          <w:tcPr>
+            <w:tcW w:type="dxa" w:w="2210"/>
+          </w:tcPr>
+          <w:p>
+            <w:pPr>
+              <w:jc w:val="left"/>
+            </w:pPr>
+            <w:r>
+              <w:rPr>
+                <w:rFonts w:ascii="Times New Roman" w:hAnsi="Times New Roman" w:eastAsia="Times New Roman"/>
+                <w:b w:val="0"/>
+                <w:i w:val="0"/>
+                <w:sz w:val="24"/>
+              </w:rPr>
+              <w:t>Micro service firm</w:t>
+            </w:r>
+          </w:p>
+        </w:tc>
+        <w:tc>
+          <w:tcPr>
+            <w:tcW w:type="dxa" w:w="2210"/>
+          </w:tcPr>
+          <w:p>
+            <w:pPr>
+              <w:jc w:val="left"/>
+            </w:pPr>
+            <w:r>
+              <w:rPr>
+                <w:rFonts w:ascii="Times New Roman" w:hAnsi="Times New Roman" w:eastAsia="Times New Roman"/>
+                <w:b w:val="0"/>
+                <w:i w:val="0"/>
+                <w:sz w:val="24"/>
+              </w:rPr>
+              <w:t>0.33</w:t>
+            </w:r>
+          </w:p>
+        </w:tc>
+        <w:tc>
+          <w:tcPr>
+            <w:tcW w:type="dxa" w:w="2210"/>
+          </w:tcPr>
+          <w:p>
+            <w:pPr>
+              <w:jc w:val="left"/>
+            </w:pPr>
+            <w:r>
+              <w:rPr>
+                <w:rFonts w:ascii="Times New Roman" w:hAnsi="Times New Roman" w:eastAsia="Times New Roman"/>
+                <w:b w:val="0"/>
+                <w:i w:val="0"/>
+                <w:sz w:val="24"/>
+              </w:rPr>
+              <w:t>0.26</w:t>
+            </w:r>
+          </w:p>
+        </w:tc>
+        <w:tc>
+          <w:tcPr>
+            <w:tcW w:type="dxa" w:w="2210"/>
+          </w:tcPr>
+          <w:p>
+            <w:pPr>
+              <w:jc w:val="left"/>
+            </w:pPr>
+            <w:r>
+              <w:rPr>
+                <w:rFonts w:ascii="Times New Roman" w:hAnsi="Times New Roman" w:eastAsia="Times New Roman"/>
+                <w:b w:val="0"/>
+                <w:i w:val="0"/>
+                <w:sz w:val="24"/>
+              </w:rPr>
+              <w:t>0.10</w:t>
+            </w:r>
+          </w:p>
+        </w:tc>
+      </w:tr>
+      <w:tr>
+        <w:tc>
+          <w:tcPr>
+            <w:tcW w:type="dxa" w:w="2210"/>
+          </w:tcPr>
+          <w:p>
+            <w:pPr>
+              <w:jc w:val="left"/>
+            </w:pPr>
+            <w:r>
+              <w:rPr>
+                <w:rFonts w:ascii="Times New Roman" w:hAnsi="Times New Roman" w:eastAsia="Times New Roman"/>
+                <w:b w:val="0"/>
+                <w:i w:val="0"/>
+                <w:sz w:val="24"/>
+              </w:rPr>
+              <w:t>Small manufacturer</w:t>
+            </w:r>
+          </w:p>
+        </w:tc>
+        <w:tc>
+          <w:tcPr>
+            <w:tcW w:type="dxa" w:w="2210"/>
+          </w:tcPr>
+          <w:p>
+            <w:pPr>
+              <w:jc w:val="left"/>
+            </w:pPr>
+            <w:r>
+              <w:rPr>
+                <w:rFonts w:ascii="Times New Roman" w:hAnsi="Times New Roman" w:eastAsia="Times New Roman"/>
+                <w:b w:val="0"/>
+                <w:i w:val="0"/>
+                <w:sz w:val="24"/>
+              </w:rPr>
+              <w:t>0.54</w:t>
+            </w:r>
+          </w:p>
+        </w:tc>
+        <w:tc>
+          <w:tcPr>
+            <w:tcW w:type="dxa" w:w="2210"/>
+          </w:tcPr>
+          <w:p>
+            <w:pPr>
+              <w:jc w:val="left"/>
+            </w:pPr>
+            <w:r>
+              <w:rPr>
+                <w:rFonts w:ascii="Times New Roman" w:hAnsi="Times New Roman" w:eastAsia="Times New Roman"/>
+                <w:b w:val="0"/>
+                <w:i w:val="0"/>
+                <w:sz w:val="24"/>
+              </w:rPr>
+              <w:t>0.43</w:t>
+            </w:r>
+          </w:p>
+        </w:tc>
+        <w:tc>
+          <w:tcPr>
+            <w:tcW w:type="dxa" w:w="2210"/>
+          </w:tcPr>
+          <w:p>
+            <w:pPr>
+              <w:jc w:val="left"/>
+            </w:pPr>
+            <w:r>
+              <w:rPr>
+                <w:rFonts w:ascii="Times New Roman" w:hAnsi="Times New Roman" w:eastAsia="Times New Roman"/>
+                <w:b w:val="0"/>
+                <w:i w:val="0"/>
+                <w:sz w:val="24"/>
+              </w:rPr>
+              <w:t>0.16</w:t>
+            </w:r>
+          </w:p>
+        </w:tc>
+      </w:tr>
+      <w:tr>
+        <w:tc>
+          <w:tcPr>
+            <w:tcW w:type="dxa" w:w="2210"/>
+          </w:tcPr>
+          <w:p>
+            <w:pPr>
+              <w:jc w:val="left"/>
+            </w:pPr>
+            <w:r>
+              <w:rPr>
+                <w:rFonts w:ascii="Times New Roman" w:hAnsi="Times New Roman" w:eastAsia="Times New Roman"/>
+                <w:b w:val="0"/>
+                <w:i w:val="0"/>
+                <w:sz w:val="24"/>
+              </w:rPr>
+              <w:t>Medium exporter</w:t>
+            </w:r>
+          </w:p>
+        </w:tc>
+        <w:tc>
+          <w:tcPr>
+            <w:tcW w:type="dxa" w:w="2210"/>
+          </w:tcPr>
+          <w:p>
+            <w:pPr>
+              <w:jc w:val="left"/>
+            </w:pPr>
+            <w:r>
+              <w:rPr>
+                <w:rFonts w:ascii="Times New Roman" w:hAnsi="Times New Roman" w:eastAsia="Times New Roman"/>
+                <w:b w:val="0"/>
+                <w:i w:val="0"/>
+                <w:sz w:val="24"/>
+              </w:rPr>
+              <w:t>0.80</w:t>
+            </w:r>
+          </w:p>
+        </w:tc>
+        <w:tc>
+          <w:tcPr>
+            <w:tcW w:type="dxa" w:w="2210"/>
+          </w:tcPr>
+          <w:p>
+            <w:pPr>
+              <w:jc w:val="left"/>
+            </w:pPr>
+            <w:r>
+              <w:rPr>
+                <w:rFonts w:ascii="Times New Roman" w:hAnsi="Times New Roman" w:eastAsia="Times New Roman"/>
+                <w:b w:val="0"/>
+                <w:i w:val="0"/>
+                <w:sz w:val="24"/>
+              </w:rPr>
+              <w:t>0.64</w:t>
+            </w:r>
+          </w:p>
+        </w:tc>
+        <w:tc>
+          <w:tcPr>
+            <w:tcW w:type="dxa" w:w="2210"/>
+          </w:tcPr>
+          <w:p>
+            <w:pPr>
+              <w:jc w:val="left"/>
+            </w:pPr>
+            <w:r>
+              <w:rPr>
+                <w:rFonts w:ascii="Times New Roman" w:hAnsi="Times New Roman" w:eastAsia="Times New Roman"/>
+                <w:b w:val="0"/>
+                <w:i w:val="0"/>
+                <w:sz w:val="24"/>
+              </w:rPr>
+              <w:t>0.24</w:t>
+            </w:r>
+          </w:p>
+        </w:tc>
+      </w:tr>
+    </w:tbl>
+    <w:p>
+      <w:pPr>
+        <w:spacing w:line="240" w:lineRule="auto" w:after="200" w:before="0"/>
+        <w:jc w:val="left"/>
+      </w:pPr>
+      <w:r>
+        <w:rPr>
+          <w:rFonts w:ascii="Times New Roman" w:hAnsi="Times New Roman" w:eastAsia="Times New Roman"/>
+          <w:b w:val="0"/>
+          <w:i/>
+          <w:sz w:val="22"/>
+        </w:rPr>
+        <w:t>Source: Authors’ illustrative computation from equations (1)–(2); β normalised to 1. Values are illustrative, not survey estimates.</w:t>
+      </w:r>
+    </w:p>
+    <w:p>
+      <w:pPr>
+        <w:spacing w:line="360" w:lineRule="auto" w:after="120" w:before="0"/>
+        <w:ind w:firstLine="432"/>
+        <w:jc w:val="both"/>
+      </w:pPr>
+      <w:r>
+        <w:rPr>
+          <w:rFonts w:ascii="Times New Roman" w:hAnsi="Times New Roman" w:eastAsia="Times New Roman"/>
+          <w:b w:val="0"/>
+          <w:i w:val="0"/>
+          <w:sz w:val="28"/>
+        </w:rPr>
+        <w:t>The illustration makes the central proposition visible: the performance gain rises with the DTI index but, for any given index value, is roughly two-and-a-half times larger when capability is high than when it is low. A digitally advanced firm with weak capability (medium exporter at C = 0.3) gains less than a modestly equipped firm with strong capability would relative to its own potential. This is the analytical content of the claim that capability, not technology, is the binding constraint, and it is the relationship that future firm-level work should estimate.</w:t>
+      </w:r>
+    </w:p>
+    <w:p>
+      <w:pPr>
+        <w:spacing w:line="360" w:lineRule="auto" w:before="160" w:after="80"/>
+        <w:jc w:val="left"/>
+      </w:pPr>
+      <w:r>
+        <w:rPr>
+          <w:rFonts w:ascii="Times New Roman" w:hAnsi="Times New Roman" w:eastAsia="Times New Roman"/>
+          <w:b/>
+          <w:i/>
+          <w:sz w:val="28"/>
+        </w:rPr>
+        <w:t>4.2. Regional evidence from emerging Asia</w:t>
+      </w:r>
+    </w:p>
+    <w:p>
+      <w:pPr>
+        <w:spacing w:line="360" w:lineRule="auto" w:after="120" w:before="0"/>
+        <w:ind w:firstLine="432"/>
+        <w:jc w:val="both"/>
+      </w:pPr>
+      <w:r>
+        <w:rPr>
+          <w:rFonts w:ascii="Times New Roman" w:hAnsi="Times New Roman" w:eastAsia="Times New Roman"/>
+          <w:b w:val="0"/>
+          <w:i w:val="0"/>
+          <w:sz w:val="28"/>
+        </w:rPr>
+        <w:t>Across the ASEAN member states, micro, small and medium-sized enterprises account for the overwhelming majority of firms and the bulk of employment, and the regional digital economy is expanding rapidly (Asian Development Bank, 2023). The constraints on their digital transformation are, however, systematic. Yoshino and Taghizadeh-Hesary (2016) show that Asian SMEs are held back by limited access to finance, the absence of comprehensive databases, low research and development spending and underdeveloped sales channels — conditions that depress the capability term in the framework. The OECD and ERIA (2024) confirm that, although ASEAN governments have strengthened SME policy frameworks, the digitalisation of smaller firms remains uneven and skills and finance are recurring bottlenecks. The regional statistics therefore indicate that connectivity and policy ambition are necessary but not sufficient: the binding constraint is the capability term C in equation (2).</w:t>
+      </w:r>
+    </w:p>
+    <w:p>
+      <w:pPr>
+        <w:spacing w:line="360" w:lineRule="auto" w:before="160" w:after="80"/>
+        <w:jc w:val="left"/>
+      </w:pPr>
+      <w:r>
+        <w:rPr>
+          <w:rFonts w:ascii="Times New Roman" w:hAnsi="Times New Roman" w:eastAsia="Times New Roman"/>
+          <w:b/>
+          <w:i/>
+          <w:sz w:val="28"/>
+        </w:rPr>
+        <w:t>4.3. Case illustration: Uzbekistan</w:t>
+      </w:r>
+    </w:p>
+    <w:p>
+      <w:pPr>
+        <w:spacing w:line="360" w:lineRule="auto" w:after="120" w:before="0"/>
+        <w:ind w:firstLine="432"/>
+        <w:jc w:val="both"/>
+      </w:pPr>
+      <w:r>
+        <w:rPr>
+          <w:rFonts w:ascii="Times New Roman" w:hAnsi="Times New Roman" w:eastAsia="Times New Roman"/>
+          <w:b w:val="0"/>
+          <w:i w:val="0"/>
+          <w:sz w:val="28"/>
+        </w:rPr>
+        <w:t>Uzbekistan illustrates both the opportunity and the constraint with particular clarity, and is presented here as a case rather than as a statistical test. SMEs are central to the economy: the World Bank (2025) reports that micro, small and medium-sized enterprises account for over ninety per cent of businesses, about seventy-five per cent of employment and roughly fifty-five per cent of gross domestic product, and the national statistics authorities record more than 1.2 million small businesses in early 2025. Connectivity and e-commerce have grown quickly from a low base; the World Bank (2023) reports that the e-commerce market expanded roughly fivefold between 2018 and 2022, exceeding half a billion United States dollars by 2023, and national policy under the Digital Uzbekistan 2030 strategy aims to turn the country into a regional information-technology hub with sharply higher technology exports and large-scale job creation.</w:t>
+      </w:r>
+    </w:p>
+    <w:p>
+      <w:pPr>
+        <w:spacing w:line="360" w:lineRule="auto" w:after="120" w:before="0"/>
+        <w:ind w:firstLine="432"/>
+        <w:jc w:val="both"/>
+      </w:pPr>
+      <w:r>
+        <w:rPr>
+          <w:rFonts w:ascii="Times New Roman" w:hAnsi="Times New Roman" w:eastAsia="Times New Roman"/>
+          <w:b w:val="0"/>
+          <w:i w:val="0"/>
+          <w:sz w:val="28"/>
+        </w:rPr>
+        <w:t>The deeper transformation of enterprises nonetheless lags the roll-out of infrastructure. UNESCAP (2025) reports that only about ten per cent of SMEs were registered on the national digital public-services portal, a direct indication that adoption of even basic digital government services — let alone analytics or artificial intelligence — remains shallow. Interpreted through the framework, Uzbek SMEs increasingly possess the drivers and the connectivity but not yet the capability — skills, finance and managerial capacity — that converts adoption into performance. Table 2 summarises the regional and Uzbekistan evidence.</w:t>
+      </w:r>
+    </w:p>
+    <w:p>
+      <w:pPr>
+        <w:spacing w:line="240" w:lineRule="auto" w:after="40" w:before="0"/>
+        <w:jc w:val="left"/>
+      </w:pPr>
+      <w:r>
+        <w:rPr>
+          <w:rFonts w:ascii="Times New Roman" w:hAnsi="Times New Roman" w:eastAsia="Times New Roman"/>
+          <w:b/>
+          <w:i w:val="0"/>
+          <w:sz w:val="28"/>
+        </w:rPr>
+        <w:t>Table 2</w:t>
+      </w:r>
+    </w:p>
+    <w:p>
+      <w:pPr>
+        <w:spacing w:line="240" w:lineRule="auto" w:after="80" w:before="0"/>
+        <w:jc w:val="left"/>
+      </w:pPr>
+      <w:r>
+        <w:rPr>
+          <w:rFonts w:ascii="Times New Roman" w:hAnsi="Times New Roman" w:eastAsia="Times New Roman"/>
+          <w:b/>
+          <w:i w:val="0"/>
+          <w:sz w:val="24"/>
+        </w:rPr>
+        <w:t>Digital transformation of SMEs in emerging Asia: selected secondary evidence</w:t>
       </w:r>
     </w:p>
     <w:tbl>
@@ -546,7 +1190,7 @@
                 <w:i w:val="0"/>
                 <w:sz w:val="24"/>
               </w:rPr>
-              <w:t>Framework block</w:t>
+              <w:t>Indicator / observation</w:t>
             </w:r>
           </w:p>
         </w:tc>
@@ -565,7 +1209,7 @@
                 <w:i w:val="0"/>
                 <w:sz w:val="24"/>
               </w:rPr>
-              <w:t>Digital element / capability</w:t>
+              <w:t>Evidence</w:t>
             </w:r>
           </w:p>
         </w:tc>
@@ -584,7 +1228,7 @@
                 <w:i w:val="0"/>
                 <w:sz w:val="24"/>
               </w:rPr>
-              <w:t>Managerial lever</w:t>
+              <w:t>Source</w:t>
             </w:r>
           </w:p>
         </w:tc>
@@ -605,7 +1249,7 @@
                 <w:i w:val="0"/>
                 <w:sz w:val="24"/>
               </w:rPr>
-              <w:t>Drivers</w:t>
+              <w:t>MSME share of enterprises, ASEAN</w:t>
             </w:r>
           </w:p>
         </w:tc>
@@ -624,7 +1268,7 @@
                 <w:i w:val="0"/>
                 <w:sz w:val="24"/>
               </w:rPr>
-              <w:t>Market pressure; technology cost; policy and funding</w:t>
+              <w:t>On average &gt; 97% of firms</w:t>
             </w:r>
           </w:p>
         </w:tc>
@@ -643,7 +1287,7 @@
                 <w:i w:val="0"/>
                 <w:sz w:val="24"/>
               </w:rPr>
-              <w:t>Environmental scanning; use of public support</w:t>
+              <w:t>ADB (2023)</w:t>
             </w:r>
           </w:p>
         </w:tc>
@@ -664,7 +1308,7 @@
                 <w:i w:val="0"/>
                 <w:sz w:val="24"/>
               </w:rPr>
-              <w:t>Sensing</w:t>
+              <w:t>Main SME constraints in Asia</w:t>
             </w:r>
           </w:p>
         </w:tc>
@@ -683,7 +1327,7 @@
                 <w:i w:val="0"/>
                 <w:sz w:val="24"/>
               </w:rPr>
-              <w:t>Connectivity; web presence; market intelligence</w:t>
+              <w:t>Finance; databases; R&amp;D; sales channels</w:t>
             </w:r>
           </w:p>
         </w:tc>
@@ -702,7 +1346,7 @@
                 <w:i w:val="0"/>
                 <w:sz w:val="24"/>
               </w:rPr>
-              <w:t>Digital awareness; customer-data analysis</w:t>
+              <w:t>Yoshino &amp; Taghizadeh-Hesary (2016)</w:t>
             </w:r>
           </w:p>
         </w:tc>
@@ -723,7 +1367,7 @@
                 <w:i w:val="0"/>
                 <w:sz w:val="24"/>
               </w:rPr>
-              <w:t>Seizing</w:t>
+              <w:t>Uzbekistan – MSME role</w:t>
             </w:r>
           </w:p>
         </w:tc>
@@ -742,7 +1386,7 @@
                 <w:i w:val="0"/>
                 <w:sz w:val="24"/>
               </w:rPr>
-              <w:t>Digital payments; cloud services; e-commerce</w:t>
+              <w:t>&gt; 90% of firms; ~75% jobs; ~55% of GDP</w:t>
             </w:r>
           </w:p>
         </w:tc>
@@ -761,7 +1405,7 @@
                 <w:i w:val="0"/>
                 <w:sz w:val="24"/>
               </w:rPr>
-              <w:t>Investment decisions; business-model redesign</w:t>
+              <w:t>World Bank (2025)</w:t>
             </w:r>
           </w:p>
         </w:tc>
@@ -782,7 +1426,7 @@
                 <w:i w:val="0"/>
                 <w:sz w:val="24"/>
               </w:rPr>
-              <w:t>Reconfiguring</w:t>
+              <w:t>Uzbekistan – e-commerce</w:t>
             </w:r>
           </w:p>
         </w:tc>
@@ -801,7 +1445,7 @@
                 <w:i w:val="0"/>
                 <w:sz w:val="24"/>
               </w:rPr>
-              <w:t>Data analytics; AI; process integration</w:t>
+              <w:t>~5× growth 2018–2022; &gt; USD 0.5 bn (2023)</w:t>
             </w:r>
           </w:p>
         </w:tc>
@@ -820,7 +1464,7 @@
                 <w:i w:val="0"/>
                 <w:sz w:val="24"/>
               </w:rPr>
-              <w:t>Skills development; change management</w:t>
+              <w:t>World Bank (2023)</w:t>
             </w:r>
           </w:p>
         </w:tc>
@@ -841,7 +1485,7 @@
                 <w:i w:val="0"/>
                 <w:sz w:val="24"/>
               </w:rPr>
-              <w:t>Protection</w:t>
+              <w:t>Uzbekistan – SMEs on e-gov portal</w:t>
             </w:r>
           </w:p>
         </w:tc>
@@ -860,7 +1504,7 @@
                 <w:i w:val="0"/>
                 <w:sz w:val="24"/>
               </w:rPr>
-              <w:t>Cybersecurity and data governance</w:t>
+              <w:t>Only ~10% registered</w:t>
             </w:r>
           </w:p>
         </w:tc>
@@ -879,7 +1523,7 @@
                 <w:i w:val="0"/>
                 <w:sz w:val="24"/>
               </w:rPr>
-              <w:t>Risk management; compliance</w:t>
+              <w:t>UNESCAP (2025)</w:t>
             </w:r>
           </w:p>
         </w:tc>
@@ -900,7 +1544,7 @@
                 <w:i w:val="0"/>
                 <w:sz w:val="24"/>
               </w:rPr>
-              <w:t>Performance</w:t>
+              <w:t>Binding constraint (framework)</w:t>
             </w:r>
           </w:p>
         </w:tc>
@@ -919,7 +1563,7 @@
                 <w:i w:val="0"/>
                 <w:sz w:val="24"/>
               </w:rPr>
-              <w:t>Productivity; growth and exports; resilience</w:t>
+              <w:t>Capability: skills, finance, management</w:t>
             </w:r>
           </w:p>
         </w:tc>
@@ -938,7 +1582,7 @@
                 <w:i w:val="0"/>
                 <w:sz w:val="24"/>
               </w:rPr>
-              <w:t>Monitoring and reinvestment of gains</w:t>
+              <w:t>This study</w:t>
             </w:r>
           </w:p>
         </w:tc>
@@ -956,7 +1600,7 @@
           <w:i/>
           <w:sz w:val="22"/>
         </w:rPr>
-        <w:t>Source: Authors’ elaboration based on Teece (2007), Tornatzky and Fleischer (1990) and OECD (2021).</w:t>
+        <w:t>Source: Compiled by the authors from the cited institutional sources.</w:t>
       </w:r>
     </w:p>
     <w:p>
@@ -971,7 +1615,7 @@
           <w:i w:val="0"/>
           <w:sz w:val="28"/>
         </w:rPr>
-        <w:t>3. Evidence from emerging Asia</w:t>
+        <w:t>5. Management and policy implications</w:t>
       </w:r>
     </w:p>
     <w:p>
@@ -987,7 +1631,7 @@
           <w:i w:val="0"/>
           <w:sz w:val="28"/>
         </w:rPr>
-        <w:t>The framework can be illustrated with the experience of emerging Asia, where SMEs are at once economically dominant and digitally constrained. Across the ASEAN member states, micro, small and medium-sized enterprises account for the overwhelming majority of firms and the bulk of employment, and the regional digital economy is expanding rapidly (Asian Development Bank, 2023). The constraints on their digital transformation are, however, systematic. Yoshino and Taghizadeh-Hesary (2016) show that Asian SMEs are held back by limited access to finance, the absence of comprehensive databases, low research and development spending and underdeveloped sales channels — precisely the conditions that depress the capability term in the framework. The OECD and ERIA (2024) confirm that, while ASEAN governments have strengthened SME policy frameworks, the digitalisation of smaller firms remains uneven and skills and finance are recurring bottlenecks.</w:t>
+        <w:t>For the management of the individual SME, the framework implies that investment should be sequenced according to capability rather than technology fashion. Because performance depends on the product of digital-transformation intensity and capability (equation 2), a firm with weak capabilities gains more from building sensing and absorptive capacity — digital skills, data literacy and a clear digital element of strategy — than from acquiring advanced tools it cannot embed. Adoption should follow the sequence of the framework: secure connectivity and a market-facing digital channel, including the digital-payment and e-commerce platforms spreading fastest in Asian markets; move core processes to cloud-based and enterprise software; and only then layer on analytics and artificial intelligence, with cybersecurity and data governance treated as a precondition. Digital strategy should be fused with business strategy and owned by the management team, not delegated as a technical project (Bharadwaj et al., 2013; Westerman et al., 2014).</w:t>
       </w:r>
     </w:p>
     <w:p>
@@ -1003,7 +1647,7 @@
           <w:i w:val="0"/>
           <w:sz w:val="28"/>
         </w:rPr>
-        <w:t>The Central Asian economies illustrate both the opportunity and the constraint with particular clarity. Connectivity and digital infrastructure have improved quickly, and e-commerce has grown from a low base: in Uzbekistan, the World Bank reports that the e-commerce market expanded roughly fivefold between 2018 and 2022, exceeding half a billion United States dollars by 2023. National policy is ambitious; under the Digital Uzbekistan 2030 strategy and the country’s development agenda, the authorities aim to turn Uzbekistan into a regional information-technology hub, with sharply higher technology exports and large-scale job creation in the sector (World Bank, 2023). Yet the same sources note that implementation is uneven and that the deeper transformation of enterprises — as opposed to the roll-out of infrastructure — depends on skills, finance and managerial capacity that remain scarce. In the language of the framework, Central Asian SMEs increasingly have the drivers and the connectivity, but not yet the capabilities that convert adoption into performance.</w:t>
+        <w:t>For policy in Asian emerging economies, the same logic reframes public support. Because the binding constraint is capability rather than connectivity, support should shift from subsidising hardware towards building skills and absorptive capacity: management and digital-skills training, advisory and diagnostic services, and demonstrator projects that reduce the uncertainty about returns that deters SME investment. Two Asia-specific priorities follow. First, the finance constraint identified by Yoshino and Taghizadeh-Hesary (2016) should be addressed directly, by bundling affordable finance with advice and by building the SME databases and credit information that lower the cost of lending. Second, shared public digital infrastructure — interoperable digital-payment systems, digital identity and the e-government services on which Uzbek SME uptake is still only about ten per cent (UNESCAP, 2025) — lowers the fixed cost of transformation for the smallest firms and should be prioritised (OECD &amp; ERIA, 2024; World Bank, 2023; Asian Development Bank, 2024).</w:t>
       </w:r>
     </w:p>
     <w:p>
@@ -1019,407 +1663,7 @@
           <w:i w:val="0"/>
           <w:sz w:val="28"/>
         </w:rPr>
-        <w:t>Table 2 summarises the Asian picture. Read through the framework, the regional evidence delivers a consistent message: connectivity and policy ambition are necessary but not sufficient. The binding constraint on SME performance is the capability term C in equation (2) — digital skills, finance and managerial capacity — rather than the availability of technology, and the reinvestment feedback loop helps explain why early movers and dynamic urban firms pull ahead while the mass of smaller enterprises risk being locked into a low-intensity equilibrium.</w:t>
-      </w:r>
-    </w:p>
-    <w:p>
-      <w:pPr>
-        <w:spacing w:line="240" w:lineRule="auto" w:after="40" w:before="0"/>
-        <w:jc w:val="left"/>
-      </w:pPr>
-      <w:r>
-        <w:rPr>
-          <w:rFonts w:ascii="Times New Roman" w:hAnsi="Times New Roman" w:eastAsia="Times New Roman"/>
-          <w:b/>
-          <w:i w:val="0"/>
-          <w:sz w:val="28"/>
-        </w:rPr>
-        <w:t>Table 2</w:t>
-      </w:r>
-    </w:p>
-    <w:p>
-      <w:pPr>
-        <w:spacing w:line="240" w:lineRule="auto" w:after="80" w:before="0"/>
-        <w:jc w:val="left"/>
-      </w:pPr>
-      <w:r>
-        <w:rPr>
-          <w:rFonts w:ascii="Times New Roman" w:hAnsi="Times New Roman" w:eastAsia="Times New Roman"/>
-          <w:b/>
-          <w:i w:val="0"/>
-          <w:sz w:val="24"/>
-        </w:rPr>
-        <w:t>Digital transformation of SMEs in emerging Asia: selected observations</w:t>
-      </w:r>
-    </w:p>
-    <w:tbl>
-      <w:tblPr>
-        <w:tblStyle w:val="TableGrid"/>
-        <w:tblW w:type="auto" w:w="0"/>
-        <w:jc w:val="center"/>
-        <w:tblLook w:firstColumn="1" w:firstRow="1" w:lastColumn="0" w:lastRow="0" w:noHBand="0" w:noVBand="1" w:val="04A0"/>
-      </w:tblPr>
-      <w:tblGrid>
-        <w:gridCol w:w="4421"/>
-        <w:gridCol w:w="4421"/>
-      </w:tblGrid>
-      <w:tr>
-        <w:tc>
-          <w:tcPr>
-            <w:tcW w:type="dxa" w:w="4421"/>
-          </w:tcPr>
-          <w:p>
-            <w:pPr>
-              <w:jc w:val="center"/>
-            </w:pPr>
-            <w:r>
-              <w:rPr>
-                <w:rFonts w:ascii="Times New Roman" w:hAnsi="Times New Roman" w:eastAsia="Times New Roman"/>
-                <w:b/>
-                <w:i w:val="0"/>
-                <w:sz w:val="24"/>
-              </w:rPr>
-              <w:t>Indicator / observation</w:t>
-            </w:r>
-          </w:p>
-        </w:tc>
-        <w:tc>
-          <w:tcPr>
-            <w:tcW w:type="dxa" w:w="4421"/>
-          </w:tcPr>
-          <w:p>
-            <w:pPr>
-              <w:jc w:val="center"/>
-            </w:pPr>
-            <w:r>
-              <w:rPr>
-                <w:rFonts w:ascii="Times New Roman" w:hAnsi="Times New Roman" w:eastAsia="Times New Roman"/>
-                <w:b/>
-                <w:i w:val="0"/>
-                <w:sz w:val="24"/>
-              </w:rPr>
-              <w:t>Evidence</w:t>
-            </w:r>
-          </w:p>
-        </w:tc>
-      </w:tr>
-      <w:tr>
-        <w:tc>
-          <w:tcPr>
-            <w:tcW w:type="dxa" w:w="4421"/>
-          </w:tcPr>
-          <w:p>
-            <w:pPr>
-              <w:jc w:val="left"/>
-            </w:pPr>
-            <w:r>
-              <w:rPr>
-                <w:rFonts w:ascii="Times New Roman" w:hAnsi="Times New Roman" w:eastAsia="Times New Roman"/>
-                <w:b w:val="0"/>
-                <w:i w:val="0"/>
-                <w:sz w:val="24"/>
-              </w:rPr>
-              <w:t>MSME share of enterprises in ASEAN</w:t>
-            </w:r>
-          </w:p>
-        </w:tc>
-        <w:tc>
-          <w:tcPr>
-            <w:tcW w:type="dxa" w:w="4421"/>
-          </w:tcPr>
-          <w:p>
-            <w:pPr>
-              <w:jc w:val="left"/>
-            </w:pPr>
-            <w:r>
-              <w:rPr>
-                <w:rFonts w:ascii="Times New Roman" w:hAnsi="Times New Roman" w:eastAsia="Times New Roman"/>
-                <w:b w:val="0"/>
-                <w:i w:val="0"/>
-                <w:sz w:val="24"/>
-              </w:rPr>
-              <w:t>On average more than 97% of all firms</w:t>
-            </w:r>
-          </w:p>
-        </w:tc>
-      </w:tr>
-      <w:tr>
-        <w:tc>
-          <w:tcPr>
-            <w:tcW w:type="dxa" w:w="4421"/>
-          </w:tcPr>
-          <w:p>
-            <w:pPr>
-              <w:jc w:val="left"/>
-            </w:pPr>
-            <w:r>
-              <w:rPr>
-                <w:rFonts w:ascii="Times New Roman" w:hAnsi="Times New Roman" w:eastAsia="Times New Roman"/>
-                <w:b w:val="0"/>
-                <w:i w:val="0"/>
-                <w:sz w:val="24"/>
-              </w:rPr>
-              <w:t>Role in the economy</w:t>
-            </w:r>
-          </w:p>
-        </w:tc>
-        <w:tc>
-          <w:tcPr>
-            <w:tcW w:type="dxa" w:w="4421"/>
-          </w:tcPr>
-          <w:p>
-            <w:pPr>
-              <w:jc w:val="left"/>
-            </w:pPr>
-            <w:r>
-              <w:rPr>
-                <w:rFonts w:ascii="Times New Roman" w:hAnsi="Times New Roman" w:eastAsia="Times New Roman"/>
-                <w:b w:val="0"/>
-                <w:i w:val="0"/>
-                <w:sz w:val="24"/>
-              </w:rPr>
-              <w:t>Majority of employment; large share of GDP</w:t>
-            </w:r>
-          </w:p>
-        </w:tc>
-      </w:tr>
-      <w:tr>
-        <w:tc>
-          <w:tcPr>
-            <w:tcW w:type="dxa" w:w="4421"/>
-          </w:tcPr>
-          <w:p>
-            <w:pPr>
-              <w:jc w:val="left"/>
-            </w:pPr>
-            <w:r>
-              <w:rPr>
-                <w:rFonts w:ascii="Times New Roman" w:hAnsi="Times New Roman" w:eastAsia="Times New Roman"/>
-                <w:b w:val="0"/>
-                <w:i w:val="0"/>
-                <w:sz w:val="24"/>
-              </w:rPr>
-              <w:t>Main SME constraints in Asia</w:t>
-            </w:r>
-          </w:p>
-        </w:tc>
-        <w:tc>
-          <w:tcPr>
-            <w:tcW w:type="dxa" w:w="4421"/>
-          </w:tcPr>
-          <w:p>
-            <w:pPr>
-              <w:jc w:val="left"/>
-            </w:pPr>
-            <w:r>
-              <w:rPr>
-                <w:rFonts w:ascii="Times New Roman" w:hAnsi="Times New Roman" w:eastAsia="Times New Roman"/>
-                <w:b w:val="0"/>
-                <w:i w:val="0"/>
-                <w:sz w:val="24"/>
-              </w:rPr>
-              <w:t>Finance; databases; R&amp;D; sales channels</w:t>
-            </w:r>
-          </w:p>
-        </w:tc>
-      </w:tr>
-      <w:tr>
-        <w:tc>
-          <w:tcPr>
-            <w:tcW w:type="dxa" w:w="4421"/>
-          </w:tcPr>
-          <w:p>
-            <w:pPr>
-              <w:jc w:val="left"/>
-            </w:pPr>
-            <w:r>
-              <w:rPr>
-                <w:rFonts w:ascii="Times New Roman" w:hAnsi="Times New Roman" w:eastAsia="Times New Roman"/>
-                <w:b w:val="0"/>
-                <w:i w:val="0"/>
-                <w:sz w:val="24"/>
-              </w:rPr>
-              <w:t>Uzbekistan – e-commerce growth</w:t>
-            </w:r>
-          </w:p>
-        </w:tc>
-        <w:tc>
-          <w:tcPr>
-            <w:tcW w:type="dxa" w:w="4421"/>
-          </w:tcPr>
-          <w:p>
-            <w:pPr>
-              <w:jc w:val="left"/>
-            </w:pPr>
-            <w:r>
-              <w:rPr>
-                <w:rFonts w:ascii="Times New Roman" w:hAnsi="Times New Roman" w:eastAsia="Times New Roman"/>
-                <w:b w:val="0"/>
-                <w:i w:val="0"/>
-                <w:sz w:val="24"/>
-              </w:rPr>
-              <w:t>About fivefold, 2018–2022; &gt; USD 0.5 bn by 2023</w:t>
-            </w:r>
-          </w:p>
-        </w:tc>
-      </w:tr>
-      <w:tr>
-        <w:tc>
-          <w:tcPr>
-            <w:tcW w:type="dxa" w:w="4421"/>
-          </w:tcPr>
-          <w:p>
-            <w:pPr>
-              <w:jc w:val="left"/>
-            </w:pPr>
-            <w:r>
-              <w:rPr>
-                <w:rFonts w:ascii="Times New Roman" w:hAnsi="Times New Roman" w:eastAsia="Times New Roman"/>
-                <w:b w:val="0"/>
-                <w:i w:val="0"/>
-                <w:sz w:val="24"/>
-              </w:rPr>
-              <w:t>Uzbekistan – policy ambition</w:t>
-            </w:r>
-          </w:p>
-        </w:tc>
-        <w:tc>
-          <w:tcPr>
-            <w:tcW w:type="dxa" w:w="4421"/>
-          </w:tcPr>
-          <w:p>
-            <w:pPr>
-              <w:jc w:val="left"/>
-            </w:pPr>
-            <w:r>
-              <w:rPr>
-                <w:rFonts w:ascii="Times New Roman" w:hAnsi="Times New Roman" w:eastAsia="Times New Roman"/>
-                <w:b w:val="0"/>
-                <w:i w:val="0"/>
-                <w:sz w:val="24"/>
-              </w:rPr>
-              <w:t>Digital 2030: regional IT hub; higher IT exports</w:t>
-            </w:r>
-          </w:p>
-        </w:tc>
-      </w:tr>
-      <w:tr>
-        <w:tc>
-          <w:tcPr>
-            <w:tcW w:type="dxa" w:w="4421"/>
-          </w:tcPr>
-          <w:p>
-            <w:pPr>
-              <w:jc w:val="left"/>
-            </w:pPr>
-            <w:r>
-              <w:rPr>
-                <w:rFonts w:ascii="Times New Roman" w:hAnsi="Times New Roman" w:eastAsia="Times New Roman"/>
-                <w:b w:val="0"/>
-                <w:i w:val="0"/>
-                <w:sz w:val="24"/>
-              </w:rPr>
-              <w:t>Binding constraint (framework)</w:t>
-            </w:r>
-          </w:p>
-        </w:tc>
-        <w:tc>
-          <w:tcPr>
-            <w:tcW w:type="dxa" w:w="4421"/>
-          </w:tcPr>
-          <w:p>
-            <w:pPr>
-              <w:jc w:val="left"/>
-            </w:pPr>
-            <w:r>
-              <w:rPr>
-                <w:rFonts w:ascii="Times New Roman" w:hAnsi="Times New Roman" w:eastAsia="Times New Roman"/>
-                <w:b w:val="0"/>
-                <w:i w:val="0"/>
-                <w:sz w:val="24"/>
-              </w:rPr>
-              <w:t>Capability: digital skills, finance, management</w:t>
-            </w:r>
-          </w:p>
-        </w:tc>
-      </w:tr>
-    </w:tbl>
-    <w:p>
-      <w:pPr>
-        <w:spacing w:line="240" w:lineRule="auto" w:after="200" w:before="0"/>
-        <w:jc w:val="left"/>
-      </w:pPr>
-      <w:r>
-        <w:rPr>
-          <w:rFonts w:ascii="Times New Roman" w:hAnsi="Times New Roman" w:eastAsia="Times New Roman"/>
-          <w:b w:val="0"/>
-          <w:i/>
-          <w:sz w:val="22"/>
-        </w:rPr>
-        <w:t>Source: Compiled by the authors from Asian Development Bank (2023, 2024), Yoshino and Taghizadeh-Hesary (2016), OECD and ERIA (2024) and World Bank (2023).</w:t>
-      </w:r>
-    </w:p>
-    <w:p>
-      <w:pPr>
-        <w:spacing w:line="360" w:lineRule="auto" w:before="200" w:after="120"/>
-        <w:jc w:val="left"/>
-      </w:pPr>
-      <w:r>
-        <w:rPr>
-          <w:rFonts w:ascii="Times New Roman" w:hAnsi="Times New Roman" w:eastAsia="Times New Roman"/>
-          <w:b/>
-          <w:i w:val="0"/>
-          <w:sz w:val="28"/>
-        </w:rPr>
-        <w:t>4. Management and policy implications</w:t>
-      </w:r>
-    </w:p>
-    <w:p>
-      <w:pPr>
-        <w:spacing w:line="360" w:lineRule="auto" w:after="120" w:before="0"/>
-        <w:ind w:firstLine="432"/>
-        <w:jc w:val="both"/>
-      </w:pPr>
-      <w:r>
-        <w:rPr>
-          <w:rFonts w:ascii="Times New Roman" w:hAnsi="Times New Roman" w:eastAsia="Times New Roman"/>
-          <w:b w:val="0"/>
-          <w:i w:val="0"/>
-          <w:sz w:val="28"/>
-        </w:rPr>
-        <w:t>For the management of the individual SME, the framework implies that investment should be sequenced according to capability rather than technology fashion. Because performance depends on the product of digital-transformation intensity and capability (equation 2), an SME with weak capabilities gains more from building sensing and absorptive capacity — digital skills, data literacy and a clear digital element of strategy — than from acquiring advanced tools it cannot embed. Adoption should follow the sequence of the framework: secure connectivity and a market-facing digital channel, including the digital-payment and e-commerce platforms that are spreading fastest in Asian markets; move core processes to cloud-based and enterprise software; and only then layer on analytics and artificial intelligence, with cybersecurity and data governance treated as a precondition rather than an afterthought (OECD, 2021; Westerman et al., 2014). Crucially, digital strategy should be fused with business strategy and owned by the management team, not delegated as a technical project (Bharadwaj et al., 2013).</w:t>
-      </w:r>
-    </w:p>
-    <w:p>
-      <w:pPr>
-        <w:spacing w:line="360" w:lineRule="auto" w:after="120" w:before="0"/>
-        <w:ind w:firstLine="432"/>
-        <w:jc w:val="both"/>
-      </w:pPr>
-      <w:r>
-        <w:rPr>
-          <w:rFonts w:ascii="Times New Roman" w:hAnsi="Times New Roman" w:eastAsia="Times New Roman"/>
-          <w:b w:val="0"/>
-          <w:i w:val="0"/>
-          <w:sz w:val="28"/>
-        </w:rPr>
-        <w:t>For policy in Asian emerging economies, the same logic reframes public support. Because the binding constraint is capability rather than connectivity, support should shift from subsidising hardware towards building skills and absorptive capacity: management and digital-skills training, advisory and diagnostic services, and demonstrator projects that reduce the uncertainty about returns that deters SME investment. Two Asia-specific priorities follow from the regional evidence. First, the finance constraint identified by Yoshino and Taghizadeh-Hesary (2016) should be addressed directly, by bundling affordable finance with advice and by developing the SME databases and credit information that lower the cost of lending. Second, public digital infrastructure — interoperable digital-payment systems, digital identity and trade-facilitating platforms — lowers the fixed cost of transformation for the smallest firms and should be prioritised, as the ASEAN and Central Asian experiences suggest (OECD &amp; ERIA, 2024; World Bank, 2023; Asian Development Bank, 2024).</w:t>
-      </w:r>
-    </w:p>
-    <w:p>
-      <w:pPr>
-        <w:spacing w:line="360" w:lineRule="auto" w:after="120" w:before="0"/>
-        <w:ind w:firstLine="432"/>
-        <w:jc w:val="both"/>
-      </w:pPr>
-      <w:r>
-        <w:rPr>
-          <w:rFonts w:ascii="Times New Roman" w:hAnsi="Times New Roman" w:eastAsia="Times New Roman"/>
-          <w:b w:val="0"/>
-          <w:i w:val="0"/>
-          <w:sz w:val="28"/>
-        </w:rPr>
-        <w:t>The two levels are complementary. Public investment in skills, finance and digital infrastructure raises the average capability level C across the SME population, which increases the performance return to any given level of technology adoption and so strengthens the incentive for firms to invest. Firm-level reinvestment of the resulting gains then sustains the virtuous cycle. Where this complementarity is neglected — where infrastructure and grants are provided without capability — the predictable outcome is adoption without transformation, and the gap between dynamic and lagging firms persists.</w:t>
+        <w:t>The two levels are complementary. Public investment in skills, finance and digital infrastructure raises the average capability level C across the SME population, which increases the performance return to any given level of technology adoption and so strengthens the incentive for firms to invest; firm-level reinvestment of the resulting gains sustains the virtuous cycle. Where this complementarity is neglected — where infrastructure and grants are provided without capability — the predictable outcome is adoption without transformation, and the gap between dynamic and lagging firms persists.</w:t>
       </w:r>
     </w:p>
     <w:p>
@@ -1450,7 +1694,7 @@
           <w:i w:val="0"/>
           <w:sz w:val="28"/>
         </w:rPr>
-        <w:t>Digital transformation is the dominant management challenge facing contemporary enterprises, and it is most demanding for the small and medium-sized firms that form the backbone of the economies of emerging Asia. This article has argued that the decisive factor is not access to technology but the managerial capability to absorb it. Integrating the process view of digital transformation with the dynamic-capabilities perspective, it proposed a management framework that links external drivers, the firm’s sensing, seizing and reconfiguring capabilities, the depth of the transformation undertaken and the resulting performance, closed by a reinvestment feedback loop, and it made the central construct measurable through a digital-transformation intensity index.</w:t>
+        <w:t>Digital transformation is the dominant management challenge facing contemporary enterprises, and it is most demanding for the small and medium-sized firms that form the backbone of the economies of emerging Asia. This study argued that the decisive factor is not access to technology but the managerial capability to absorb it, and it offered three contributions: a firm-level, management-actionable digital-transformation intensity index; a multiplicative DTI×capability specification that renders the capability-as-binding-constraint proposition testable and distinguishes the framework from macro indices and from factor-listing reviews; and an application to emerging Asia and to the under-researched Central Asian context, illustrated by Uzbekistan.</w:t>
       </w:r>
     </w:p>
     <w:p>
@@ -1466,7 +1710,7 @@
           <w:i w:val="0"/>
           <w:sz w:val="28"/>
         </w:rPr>
-        <w:t>Confronted with evidence from the ASEAN region and from the fast-digitalising economies of Central Asia, with Uzbekistan as an illustrative case, the framework accounts for a persistent pattern: connectivity and policy ambition are advancing quickly, but the capability to turn technology into performance — skills, finance and management — lags behind. The practical message for managers is to sequence investment by capability and to own digital strategy at the top of the firm; the message for policymakers is to fund skills, finance and shared digital infrastructure, not hardware alone. The framework is conceptual and its index and performance relationship are proposed rather than estimated; the natural next step is empirical validation on firm-level data from Asian emerging economies, which would allow the return to transformation and the capability threshold to be quantified and the policy priorities to be sharpened.</w:t>
+        <w:t>Examined against secondary evidence from the ASEAN region and Uzbekistan, the framework accounts for a consistent pattern: connectivity and policy ambition advance quickly, but the capability to turn technology into performance — skills, finance and management — lags behind. The practical message for managers is to sequence investment by capability and to own digital strategy at the top of the firm; for policymakers, to fund skills, finance and shared digital infrastructure rather than hardware alone. The study’s main limitation is that the DTI index and the performance relationship are illustrated rather than estimated; the worked application uses assumed, not surveyed, adoption values. The clear next step is empirical validation on firm-level data — for example the World Bank Enterprise Surveys or a primary survey of Uzbek and ASEAN SMEs — which would allow the return to transformation β and the capability threshold to be quantified and the policy priorities to be sharpened.</w:t>
       </w:r>
     </w:p>
     <w:p>
@@ -1561,6 +1805,22 @@
           <w:i w:val="0"/>
           <w:sz w:val="28"/>
         </w:rPr>
+        <w:t>de Mattos, C. S., Pellegrini, G., Hagelaar, G., &amp; Dolfsma, W. (2024). Systematic literature review on technological transformation in SMEs: A transformation encompassing technology assimilation and business model innovation. Management Review Quarterly, 74(2), 1057–1095. https://doi.org/10.1007/s11301-023-00327-7</w:t>
+      </w:r>
+    </w:p>
+    <w:p>
+      <w:pPr>
+        <w:spacing w:line="360" w:lineRule="auto" w:after="80"/>
+        <w:ind w:left="720" w:hanging="720"/>
+        <w:jc w:val="both"/>
+      </w:pPr>
+      <w:r>
+        <w:rPr>
+          <w:rFonts w:ascii="Times New Roman" w:hAnsi="Times New Roman" w:eastAsia="Times New Roman"/>
+          <w:b w:val="0"/>
+          <w:i w:val="0"/>
+          <w:sz w:val="28"/>
+        </w:rPr>
         <w:t>Fitzgerald, M., Kruschwitz, N., Bonnet, D., &amp; Welch, M. (2014). Embracing digital technology: A new strategic imperative. MIT Sloan Management Review, 55(2), 1–12.</w:t>
       </w:r>
     </w:p>
@@ -1609,7 +1869,23 @@
           <w:i w:val="0"/>
           <w:sz w:val="28"/>
         </w:rPr>
-        <w:t>OECD, &amp; ERIA. (2024). SME Policy Index: ASEAN 2024 – Enabling sustainable growth and digitalisation. Paris: OECD Publishing / Jakarta: Economic Research Institute for ASEAN and East Asia. Available online: https://www.oecd.org/en/publications.html</w:t>
+        <w:t>OECD, &amp; ERIA. (2024). SME Policy Index: ASEAN 2024 – Enabling sustainable growth and digitalisation. Paris: OECD Publishing / Jakarta: Economic Research Institute for ASEAN and East Asia. https://doi.org/10.1787/f1f0c5f3-en</w:t>
+      </w:r>
+    </w:p>
+    <w:p>
+      <w:pPr>
+        <w:spacing w:line="360" w:lineRule="auto" w:after="80"/>
+        <w:ind w:left="720" w:hanging="720"/>
+        <w:jc w:val="both"/>
+      </w:pPr>
+      <w:r>
+        <w:rPr>
+          <w:rFonts w:ascii="Times New Roman" w:hAnsi="Times New Roman" w:eastAsia="Times New Roman"/>
+          <w:b w:val="0"/>
+          <w:i w:val="0"/>
+          <w:sz w:val="28"/>
+        </w:rPr>
+        <w:t>Sagala, G. H., &amp; Őri, D. (2024). Toward SMEs digital transformation success: A systematic literature review. Information Systems and e-Business Management, 22(4), 667–719. https://doi.org/10.1007/s10257-024-00682-2</w:t>
       </w:r>
     </w:p>
     <w:p>
@@ -1641,7 +1917,55 @@
           <w:i w:val="0"/>
           <w:sz w:val="28"/>
         </w:rPr>
+        <w:t>Teng, X., Wu, Z., &amp; Yang, F. (2022). Research on the relationship between digital transformation and performance of SMEs. Sustainability, 14(10), 6012. https://doi.org/10.3390/su14106012</w:t>
+      </w:r>
+    </w:p>
+    <w:p>
+      <w:pPr>
+        <w:spacing w:line="360" w:lineRule="auto" w:after="80"/>
+        <w:ind w:left="720" w:hanging="720"/>
+        <w:jc w:val="both"/>
+      </w:pPr>
+      <w:r>
+        <w:rPr>
+          <w:rFonts w:ascii="Times New Roman" w:hAnsi="Times New Roman" w:eastAsia="Times New Roman"/>
+          <w:b w:val="0"/>
+          <w:i w:val="0"/>
+          <w:sz w:val="28"/>
+        </w:rPr>
         <w:t>Tornatzky, L. G., &amp; Fleischer, M. (1990). The processes of technological innovation. Lexington, MA: Lexington Books.</w:t>
+      </w:r>
+    </w:p>
+    <w:p>
+      <w:pPr>
+        <w:spacing w:line="360" w:lineRule="auto" w:after="80"/>
+        <w:ind w:left="720" w:hanging="720"/>
+        <w:jc w:val="both"/>
+      </w:pPr>
+      <w:r>
+        <w:rPr>
+          <w:rFonts w:ascii="Times New Roman" w:hAnsi="Times New Roman" w:eastAsia="Times New Roman"/>
+          <w:b w:val="0"/>
+          <w:i w:val="0"/>
+          <w:sz w:val="28"/>
+        </w:rPr>
+        <w:t>Tranfield, D., Denyer, D., &amp; Smart, P. (2003). Towards a methodology for developing evidence-informed management knowledge by means of systematic review. British Journal of Management, 14(3), 207–222. https://doi.org/10.1111/1467-8551.00375</w:t>
+      </w:r>
+    </w:p>
+    <w:p>
+      <w:pPr>
+        <w:spacing w:line="360" w:lineRule="auto" w:after="80"/>
+        <w:ind w:left="720" w:hanging="720"/>
+        <w:jc w:val="both"/>
+      </w:pPr>
+      <w:r>
+        <w:rPr>
+          <w:rFonts w:ascii="Times New Roman" w:hAnsi="Times New Roman" w:eastAsia="Times New Roman"/>
+          <w:b w:val="0"/>
+          <w:i w:val="0"/>
+          <w:sz w:val="28"/>
+        </w:rPr>
+        <w:t>UNESCAP. (2025). Uzbekistan foresight on digital public services for small and medium-sized enterprises. Bangkok: United Nations Economic and Social Commission for Asia and the Pacific. Available online: https://www.unescap.org/events/2025/uzbekistan-foresight-digital-public-services-small-and-medium-sized-enterprises</w:t>
       </w:r>
     </w:p>
     <w:p>
@@ -1738,6 +2062,22 @@
           <w:sz w:val="28"/>
         </w:rPr>
         <w:t>World Bank. (2023, November 30). World Bank to support Uzbekistan in developing the digital economy and creating new jobs in the information technology sector (Press release). Washington, DC: World Bank. Available online: https://www.worldbank.org/en/news/press-release/2023/11/30/world-bank-to-support-uzbekistan-in-developing-the-digital-economy-and-creating-new-jobs-in-the-it-sector</w:t>
+      </w:r>
+    </w:p>
+    <w:p>
+      <w:pPr>
+        <w:spacing w:line="360" w:lineRule="auto" w:after="80"/>
+        <w:ind w:left="720" w:hanging="720"/>
+        <w:jc w:val="both"/>
+      </w:pPr>
+      <w:r>
+        <w:rPr>
+          <w:rFonts w:ascii="Times New Roman" w:hAnsi="Times New Roman" w:eastAsia="Times New Roman"/>
+          <w:b w:val="0"/>
+          <w:i w:val="0"/>
+          <w:sz w:val="28"/>
+        </w:rPr>
+        <w:t>World Bank. (2025, December 15). Improved access to finance to help 7,000 businesses in Uzbekistan grow and create jobs (Press release). Washington, DC: World Bank. Available online: https://www.worldbank.org/en/news/press-release/2025/12/15/improved-access-to-finance-to-help-7000-businesses-in-uzbekistan-grow-and-create-jobs</w:t>
       </w:r>
     </w:p>
     <w:p>

</xml_diff>

<commit_message>
Second revision: estimable interaction model, measurable capability, narrative review, recent references
- Replace pure multiplicative claim with general moderated specification (eq 3) plus
  strong-complementarity special case (eq 4); justify interaction theoretically.
- Operationalise capability C via validated Kump et al. (2019) sensing/seizing/transforming scale (eq 2).
- Add Section 3 estimation strategy (measures, OLS/SEM, marginal effects); relabel as narrative review (drop systematic-review claim).
- Reframe novelty as integrative, not a new metric; acknowledge WBES/DESI/Teng firm-level measures.
- Reframe Table 1/Figure 2 as didactic illustration; rename Uzbekistan to country vignette.
- Integrate TAM/UTAUT/TOE into the framework; add Hanelt et al. (2021), Kraus et al. (2022), Kump et al. (2019).
- Language fixes; vary abstract/conclusions openings. Figures confirmed embedded. All refs verified.
</commit_message>
<xml_diff>
--- a/Economic_Archive_Digital_Transformation_SMEs_Asia.docx
+++ b/Economic_Archive_Digital_Transformation_SMEs_Asia.docx
@@ -74,7 +74,7 @@
           <w:i w:val="0"/>
           <w:sz w:val="28"/>
         </w:rPr>
-        <w:t>Abstract: Digital transformation is the central management challenge for small and medium-sized enterprises (SMEs), which dominate the economies of emerging Asia yet adopt advanced digital technologies more slowly than large firms. This study develops and illustrates a management framework explaining how SMEs convert digital technologies into superior performance. Building on the dynamic-capabilities perspective and on the distinction between digitisation, digitalisation and digital transformation, the framework links external drivers to the firm’s sensing, seizing and reconfiguring capabilities, to the depth of the transformation undertaken, and to performance, with a reinvestment feedback loop. Its novelty is a firm-level, management-actionable digital-transformation intensity (DTI) index combined with a multiplicative DTI×capability specification that makes the “capability-as-binding-constraint” proposition testable, distinguishing it from macro composite indices and from prior conceptual reviews. The framework is built through a structured synthesis of the literature, illustrated with a worked application of the DTI index to representative SME archetypes, and examined against secondary evidence from emerging Asia, including the ASEAN region and a deeper case illustration of Uzbekistan. The analysis indicates that the binding constraint on SME performance is managerial and human capability rather than connectivity, and yields managerial and policy recommendations on capability building, finance, digital skills and shared digital infrastructure.</w:t>
+        <w:t>Abstract: Digital transformation is the central management challenge for small and medium-sized enterprises (SMEs), which dominate the economies of emerging Asia yet adopt advanced digital technologies more slowly than large firms. This study develops a management framework explaining how SMEs convert digital technologies into superior performance. Building on the dynamic-capabilities perspective and on the distinction between digitisation, digitalisation and digital transformation, the framework links external drivers to the firm’s sensing, seizing and reconfiguring capabilities, to the depth of the transformation undertaken, and to performance, with a reinvestment feedback loop. The framework’s contribution is integrative rather than metric: it embeds firm-level digital-adoption measures in a capability-conditioned model and specifies a moderated relationship — a digital-transformation intensity (DTI) measure interacting with dynamic capability — that can be empirically tested once both constructs are operationalised, which the study sets out using established adoption items and a validated dynamic-capabilities scale. The framework is built through a narrative review of the literature, illustrated with a numerical example of the moderation logic, and assessed in light of secondary evidence from emerging Asia, including the ASEAN region and a country vignette of Uzbekistan. The evidence suggests that the binding constraint on SME performance is managerial and human capability rather than connectivity, and the analysis yields managerial and policy recommendations on capability building, finance, digital skills and shared digital infrastructure.</w:t>
       </w:r>
     </w:p>
     <w:p>
@@ -151,7 +151,7 @@
           <w:i w:val="0"/>
           <w:sz w:val="28"/>
         </w:rPr>
-        <w:t>The literature has clarified what digital transformation is, but it has paid less attention to the specific managerial mechanisms through which a resource-constrained SME in an emerging economy turns technology into results. Digital transformation is more than the purchase of software; it is an organisational change process in which digital technologies reshape value creation, operations and the business model itself (Vial, 2019; Verhoef et al., 2021). Whether that process raises performance depends on the capabilities the firm can mobilise around it (Teece, 2007; Warner &amp; Wäger, 2019). Recent systematic reviews confirm that the SME literature remains fragmented and short of process guidance, and that transformation levels in SMEs are generally low (de Mattos et al., 2024; Sagala &amp; Őri, 2024).</w:t>
+        <w:t>The literature has clarified what digital transformation is, but it has paid less attention to the managerial mechanisms through which a resource-constrained SME in an emerging economy turns technology into results. Digital transformation is an organisational change process in which digital technologies reshape value creation, operations and the business model itself (Vial, 2019; Verhoef et al., 2021), and recent comprehensive reviews stress that its outcomes hinge on managerial and organisational factors rather than on technology adoption alone (Hanelt et al., 2021; Kraus et al., 2022). Whether the process raises performance depends on the capabilities the firm can mobilise around it (Teece, 2007; Warner &amp; Wäger, 2019), and SME-focused reviews report that transformation levels in smaller firms remain low and that the field still lacks process-level guidance (de Mattos et al., 2024; Sagala &amp; Őri, 2024).</w:t>
       </w:r>
     </w:p>
     <w:p>
@@ -167,7 +167,7 @@
           <w:i w:val="0"/>
           <w:sz w:val="28"/>
         </w:rPr>
-        <w:t>This study addresses that gap with a management framework connecting the external drivers of digital transformation, the dynamic capabilities of the firm, the depth of the transformation undertaken and the resulting performance, closed by a reinvestment feedback loop. Its contribution differs from prior work in three respects. First, whereas existing composite measures such as national digital-intensity indices operate at the macro level, the proposed digital-transformation intensity (DTI) index is defined at the level of the individual firm and is directly actionable by management. Second, in contrast to conceptual reviews that catalogue factors (de Mattos et al., 2024; Sagala &amp; Őri, 2024), the framework specifies a multiplicative DTI×capability relationship that turns the often-asserted claim that “technology alone is not enough” into a testable proposition. Third, it is applied to emerging Asia — the ASEAN region and the under-researched economies of Central Asia, with Uzbekistan as a case illustration — where firm-level evidence is comparatively thin.</w:t>
+        <w:t>This study addresses that gap with a management framework connecting the external drivers of digital transformation, the dynamic capabilities of the firm, the depth of the transformation undertaken and the resulting performance, closed by a reinvestment feedback loop. Its contribution is integrative rather than the proposal of a new metric. Firm-level digital adoption is already measured — for example by the World Bank Enterprise Surveys, by the European digital-intensity indicators and in survey studies such as Teng, Wu and Yang (2022). What the framework adds is, first, to embed such adoption measures in an explicit capability-conditioned causal structure; second, to state the often-asserted claim that “technology alone is not enough” as a moderated relationship with a clear empirical test (the interaction between digital-transformation intensity and dynamic capability); and third, to apply the framework to emerging Asia — the ASEAN region and the under-researched economies of Central Asia, with Uzbekistan as a country vignette — where firm-level evidence is comparatively thin.</w:t>
       </w:r>
     </w:p>
     <w:p>
@@ -183,7 +183,7 @@
           <w:i w:val="0"/>
           <w:sz w:val="28"/>
         </w:rPr>
-        <w:t>The remainder of the article is organised as follows. Section 1 reviews the literature and defines the core constructs. Section 2 presents the framework and the DTI index. Section 3 describes the data and methods. Section 4 reports an illustrative application of the index and the regional evidence, including the Uzbekistan case. Section 5 discusses the management and policy implications. The final section concludes.</w:t>
+        <w:t>The remainder of the article is organised as follows. Section 1 reviews the literature and defines the core constructs. Section 2 presents the framework, the measures and the estimable specification. Section 3 describes the data, the operationalisation of the constructs and the estimation strategy. Section 4 reports a numerical illustration of the moderation logic and the regional evidence, including the Uzbekistan vignette. Section 5 discusses the management and policy implications. The final section concludes.</w:t>
       </w:r>
     </w:p>
     <w:p>
@@ -214,7 +214,7 @@
           <w:i w:val="0"/>
           <w:sz w:val="28"/>
         </w:rPr>
-        <w:t>Research distinguishes three increasingly profound stages of digital change. Digitisation is the conversion of analogue information into digital form; digitalisation is the use of digital technologies to improve existing processes; and digital transformation is the deeper, firm-wide change in which technology reconfigures value creation and the business model (Verhoef et al., 2021). Vial (2019), synthesising a large body of work, defines digital transformation as a process in which digital technologies trigger strategic responses that alter value-creation paths while the firm manages structural change and organisational barriers. The implication for management is that technology alone does not deliver value; the value comes from the organisational changes that accompany it.</w:t>
+        <w:t>Research distinguishes three increasingly profound stages of digital change. Digitisation is the conversion of analogue information into digital form; digitalisation is the use of digital technologies to improve existing processes; and digital transformation is the deeper, firm-wide change in which technology reconfigures value creation and the business model (Verhoef et al., 2021). Vial (2019) defines digital transformation as a process in which digital technologies trigger strategic responses that alter value-creation paths while the firm manages structural change and organisational barriers; large-scale reviews confirm this organisational-change reading and the centrality of strategy and leadership (Hanelt et al., 2021; Kraus et al., 2022). The implication for management is that technology alone does not deliver value; the value comes from the organisational changes that accompany it.</w:t>
       </w:r>
     </w:p>
     <w:p>
@@ -230,7 +230,7 @@
           <w:i w:val="0"/>
           <w:sz w:val="28"/>
         </w:rPr>
-        <w:t>The dynamic-capabilities perspective explains why firms facing the same technologies achieve different results. Teece (2007) decomposes the capacity to sustain performance in changing environments into sensing opportunities and threats, seizing them through investment and business-model choices, and reconfiguring the resource base accordingly. Warner and Wäger (2019) show that digital transformation is precisely an ongoing process of strategic renewal in which these capabilities are built and rebuilt. Bharadwaj, El Sawy, Pavlou and Venkatraman (2013) argue that digital strategy can no longer be a functional adjunct to business strategy but must be fused with it; Westerman, Bonnet and McAfee (2014) add that the binding constraint is usually leadership and management capability rather than technology as such; and Fitzgerald, Kruschwitz, Bonnet and Welch (2014) document that firms widely recognise digital technology as a strategic imperative while struggling to execute it.</w:t>
+        <w:t>The dynamic-capabilities perspective explains why firms facing the same technologies achieve different results. Teece (2007) decomposes the capacity to sustain performance into sensing opportunities and threats, seizing them through investment and business-model choices, and reconfiguring (transforming) the resource base accordingly. Warner and Wäger (2019) show that digital transformation is precisely an ongoing process of strategic renewal in which these capabilities are built and rebuilt, and Kump, Engelmann, Kessler and Schweiger (2019) provide a validated survey scale that measures sensing, seizing and transforming capacities separately. Bharadwaj, El Sawy, Pavlou and Venkatraman (2013) argue that digital strategy must be fused with business strategy; Westerman, Bonnet and McAfee (2014) add that the binding constraint is usually leadership and management capability rather than technology as such; and Fitzgerald, Kruschwitz, Bonnet and Welch (2014) document that firms recognise digital technology as a strategic imperative while struggling to execute it.</w:t>
       </w:r>
     </w:p>
     <w:p>
@@ -246,7 +246,7 @@
           <w:i w:val="0"/>
           <w:sz w:val="28"/>
         </w:rPr>
-        <w:t>A further strand examines how the decision to adopt a technology is taken. The technology acceptance model relates adoption to perceived usefulness and perceived ease of use (Davis, 1989); the unified theory of acceptance and use of technology adds performance and effort expectancy, social influence and facilitating conditions (Venkatesh, Morris, Davis &amp; Davis, 2003); and the technology–organisation–environment framework situates adoption in the interplay of technological readiness, organisational resources and the external environment (Tornatzky &amp; Fleischer, 1990). For SMEs in emerging economies these frameworks matter because the adoption decision is concentrated in a small management team and is highly sensitive to skills, cost and the surrounding digital ecosystem.</w:t>
+        <w:t>A further strand explains how the adoption of a specific technology is decided, and it feeds directly into the framework’s measures. The technology acceptance model relates adoption to perceived usefulness and perceived ease of use (Davis, 1989), and the unified theory of acceptance and use of technology adds performance and effort expectancy, social influence and facilitating conditions (Venkatesh, Morris, Davis &amp; Davis, 2003); both inform the items that make up the adoption levels aggregated in the digital-transformation intensity measure below, and managerial acceptance is itself part of the sensing and seizing capability. At the organisational level, the technology–organisation–environment framework situates adoption in the interplay of technological readiness, organisational resources and the external environment (Tornatzky &amp; Fleischer, 1990), which maps onto the framework’s capability and driver blocks respectively. For SMEs in emerging economies these models matter because the adoption decision is concentrated in a small management team and is highly sensitive to skills, cost and the surrounding digital ecosystem.</w:t>
       </w:r>
     </w:p>
     <w:p>
@@ -262,7 +262,7 @@
           <w:i w:val="0"/>
           <w:sz w:val="28"/>
         </w:rPr>
-        <w:t>Recent empirical and review work sharpens the picture. Teng, Wu and Yang (2022), using a structural-equation model on 335 SMEs, find that digital technology, employee digital skills and a digital-transformation strategy are jointly and positively associated with transformation and, through it, with performance — evidence consistent with a capability-conditioned view. Systematic reviews by de Mattos, Pellegrini, Hagelaar and Dolfsma (2024) and Sagala and Őri (2024) report that the field is dominated by factor lists, lacks process-level conceptualisation, and shows generally low transformation among SMEs, while the policy-oriented literature documents the SME-specific barriers — scarce skills, limited finance and uncertainty about returns (OECD, 2021; Yoshino &amp; Taghizadeh-Hesary, 2016). Nambisan, Wright and Feldman (2019) note that digital technologies also reshape innovation and entrepreneurship themselves, raising the premium on digital capability. This body of work motivates a framework in which drivers, firm-level capabilities and the depth of transformation jointly determine performance, and a measure that operationalises it.</w:t>
+        <w:t>Recent empirical and policy work sharpens the picture. Teng et al. (2022), using a structural-equation model on 335 SMEs, find that digital technology, employee digital skills and a digital-transformation strategy are jointly and positively associated with transformation and, through it, with performance — evidence consistent with a capability-conditioned view and with an interaction between technology and capability. The policy-oriented literature documents the SME-specific barriers — scarce skills, limited finance and uncertainty about returns (OECD, 2021; Yoshino &amp; Taghizadeh-Hesary, 2016) — and Nambisan, Wright and Feldman (2019) note that digital technologies also reshape innovation and entrepreneurship themselves, raising the premium on digital capability. This body of work motivates a framework in which drivers, firm-level capabilities and the depth of transformation jointly determine performance, and a specification that can be tested.</w:t>
       </w:r>
     </w:p>
     <w:p>
@@ -277,7 +277,7 @@
           <w:i w:val="0"/>
           <w:sz w:val="28"/>
         </w:rPr>
-        <w:t>2. A management framework and the digital-transformation intensity index</w:t>
+        <w:t>2. Framework, measures and estimable specification</w:t>
       </w:r>
     </w:p>
     <w:p>
@@ -309,7 +309,7 @@
           <w:i w:val="0"/>
           <w:sz w:val="28"/>
         </w:rPr>
-        <w:t>The second block is the firm’s dynamic capabilities. Following Teece (2007), an SME senses digital opportunities and threats, seizes them by investing in technology and adjusting its business model, and reconfigures its processes, skills and structure so that the technology is actually used. The third block is the depth of the transformation undertaken, from digitisation through digitalisation to business-model change (Verhoef et al., 2021). The fourth block is performance: productivity, growth and export reach, and resilience. A feedback loop closes the framework: performance gains generate resources that are reinvested in further capability building and technology, so that successful SMEs can enter a virtuous cycle while laggards fall further behind.</w:t>
+        <w:t>The second block is the firm’s dynamic capabilities. Following Teece (2007), an SME senses digital opportunities and threats, seizes them by investing in technology and adjusting its business model, and reconfigures its processes, skills and structure so that the technology is actually used. The third block is the depth of the transformation undertaken, from digitisation through digitalisation to business-model change (Verhoef et al., 2021). The fourth block is performance: productivity, growth and export reach, and resilience. A feedback loop closes the framework: performance gains generate resources that are reinvested in further capability building and technology.</w:t>
       </w:r>
     </w:p>
     <w:p>
@@ -384,6 +384,21 @@
     </w:p>
     <w:p>
       <w:pPr>
+        <w:spacing w:line="360" w:lineRule="auto" w:before="160" w:after="80"/>
+        <w:jc w:val="left"/>
+      </w:pPr>
+      <w:r>
+        <w:rPr>
+          <w:rFonts w:ascii="Times New Roman" w:hAnsi="Times New Roman" w:eastAsia="Times New Roman"/>
+          <w:b/>
+          <w:i/>
+          <w:sz w:val="28"/>
+        </w:rPr>
+        <w:t>2.1. Measuring digital-transformation intensity and capability</w:t>
+      </w:r>
+    </w:p>
+    <w:p>
+      <w:pPr>
         <w:spacing w:line="360" w:lineRule="auto" w:after="120" w:before="0"/>
         <w:ind w:firstLine="432"/>
         <w:jc w:val="both"/>
@@ -395,7 +410,7 @@
           <w:i w:val="0"/>
           <w:sz w:val="28"/>
         </w:rPr>
-        <w:t>To make the central construct measurable, digital-transformation intensity of a firm is defined as a weighted composite of the digital technologies and practices in use,</w:t>
+        <w:t>Two constructs must be measured. Digital-transformation intensity (DTI) summarises the digital technologies and practices a firm actually uses, as a weighted composite</w:t>
       </w:r>
     </w:p>
     <w:p>
@@ -410,7 +425,7 @@
           <w:i/>
           <w:sz w:val="28"/>
         </w:rPr>
-        <w:t>DTI = Σᵢ wᵢ · aᵢ ,   with  Σᵢ wᵢ = 1,</w:t>
+        <w:t>DTI = Σᵢ wᵢ · aᵢ ,   Σᵢ wᵢ = 1 ,   aᵢ ∈ [0, 1] ,</w:t>
       </w:r>
       <w:r>
         <w:rPr>
@@ -440,7 +455,23 @@
           <w:i w:val="0"/>
           <w:sz w:val="28"/>
         </w:rPr>
-        <w:t>where aᵢ ∈ [0, 1] is the adoption level of digital element i — connectivity, a website or e-commerce channel, digital payments, cloud services, enterprise software, data analytics, artificial intelligence and digital-security measures — and wᵢ is its weight. The index returns a value between zero and one and is conceptually comparable to the digital-intensity measures used in international statistics, but it is defined and computed for the individual firm. Firm performance is modelled as increasing in digital-transformation intensity but conditional on capability,</w:t>
+        <w:t>where aᵢ is the adoption level of digital element i — connectivity, a website or e-commerce channel, digital payments, cloud services, enterprise software, data analytics, artificial intelligence and digital-security measures — and wᵢ is its weight. The elements and items follow established firm-level instruments (the World Bank Enterprise Surveys and European digital-intensity indicators) and the acceptance literature (Davis, 1989; Venkatesh et al., 2003); the measure is therefore not a new statistic but a transparent aggregation of existing ones for use inside the framework.</w:t>
+      </w:r>
+    </w:p>
+    <w:p>
+      <w:pPr>
+        <w:spacing w:line="360" w:lineRule="auto" w:after="120" w:before="0"/>
+        <w:ind w:firstLine="432"/>
+        <w:jc w:val="both"/>
+      </w:pPr>
+      <w:r>
+        <w:rPr>
+          <w:rFonts w:ascii="Times New Roman" w:hAnsi="Times New Roman" w:eastAsia="Times New Roman"/>
+          <w:b w:val="0"/>
+          <w:i w:val="0"/>
+          <w:sz w:val="28"/>
+        </w:rPr>
+        <w:t>Capability (C) is operationalised, rather than left undefined, as the firm’s dynamic capability measured on the validated scale of Kump et al. (2019), which captures sensing (S₁), seizing (S₂) and transforming (S₃) capacities through multi-item managerial-survey constructs. A composite capability index can be formed as</w:t>
       </w:r>
     </w:p>
     <w:p>
@@ -455,7 +486,7 @@
           <w:i/>
           <w:sz w:val="28"/>
         </w:rPr>
-        <w:t>ΔP = β · DTI · C + ε ,</w:t>
+        <w:t>C = (S₁ + S₂ + S₃) / 3 ,   C ∈ [0, 1] ,</w:t>
       </w:r>
       <w:r>
         <w:rPr>
@@ -485,22 +516,22 @@
           <w:i w:val="0"/>
           <w:sz w:val="28"/>
         </w:rPr>
-        <w:t>where ΔP is the change in a performance measure, C ∈ [0, 1] is the firm’s dynamic-capability level, β &gt; 0 is the return to transformation and ε captures other influences. The multiplicative term DTI·C is the core managerial proposition: technology adoption raises performance only to the extent that the firm has the capability to absorb it. A high index with weak capability — technology bought but not embedded — yields little gain, the typical failure mode for SMEs in emerging markets, and one consistent with the SEM evidence of Teng et al. (2022) that skills and strategy, not technology alone, drive the performance effect.</w:t>
+        <w:t>after rescaling each sub-scale to the unit interval, with observable complements — managerial digital skills, the presence of an explicit digital strategy, prior technology projects and staff training — available as proxies where survey access is limited. Both DTI and C are thus measurable with existing, peer-validated instruments.</w:t>
       </w:r>
     </w:p>
     <w:p>
       <w:pPr>
-        <w:spacing w:line="360" w:lineRule="auto" w:before="200" w:after="120"/>
+        <w:spacing w:line="360" w:lineRule="auto" w:before="160" w:after="80"/>
         <w:jc w:val="left"/>
       </w:pPr>
       <w:r>
         <w:rPr>
           <w:rFonts w:ascii="Times New Roman" w:hAnsi="Times New Roman" w:eastAsia="Times New Roman"/>
           <w:b/>
-          <w:i w:val="0"/>
+          <w:i/>
           <w:sz w:val="28"/>
         </w:rPr>
-        <w:t>3. Data and methods</w:t>
+        <w:t>2.2. The estimable specification</w:t>
       </w:r>
     </w:p>
     <w:p>
@@ -516,7 +547,36 @@
           <w:i w:val="0"/>
           <w:sz w:val="28"/>
         </w:rPr>
-        <w:t>The study is conceptual-empirical and proceeds in three steps. First, the framework was built through a structured narrative synthesis of the literature in the tradition of evidence-informed management review (Tranfield, Denyer &amp; Smart, 2003): peer-reviewed sources on digital transformation, dynamic capabilities and technology adoption were retrieved from Scopus- and Web of Science-indexed outlets, screened for relevance to SMEs and to performance, and synthesised into the four-block structure of Section 2. Recent systematic reviews (de Mattos et al., 2024; Sagala &amp; Őri, 2024) were used to position the contribution and to confirm the research gap.</w:t>
+        <w:t>Let ΔP denote the change in a performance measure (for example labour productivity, sales growth or export intensity). The framework’s central claim — that adoption pays off only when matched by capability — is a moderation hypothesis, which is estimated in the standard interaction form rather than asserted as a pure product:</w:t>
+      </w:r>
+    </w:p>
+    <w:p>
+      <w:pPr>
+        <w:spacing w:line="360" w:lineRule="auto" w:before="80" w:after="80"/>
+        <w:jc w:val="center"/>
+      </w:pPr>
+      <w:r>
+        <w:rPr>
+          <w:rFonts w:ascii="Times New Roman" w:hAnsi="Times New Roman" w:eastAsia="Times New Roman"/>
+          <w:b w:val="0"/>
+          <w:i/>
+          <w:sz w:val="28"/>
+        </w:rPr>
+        <w:t>ΔP = β₀ + β₁·DTI + β₂·C + β₃·(DTI×C) + γ·X + ε ,</w:t>
+      </w:r>
+      <w:r>
+        <w:rPr>
+          <w:rFonts w:ascii="Times New Roman" w:hAnsi="Times New Roman" w:eastAsia="Times New Roman"/>
+          <w:b w:val="0"/>
+          <w:i w:val="0"/>
+          <w:sz w:val="28"/>
+        </w:rPr>
+        <w:tab/>
+        <w:tab/>
+        <w:tab/>
+        <w:tab/>
+        <w:tab/>
+        <w:t>(3)</w:t>
       </w:r>
     </w:p>
     <w:p>
@@ -532,7 +592,36 @@
           <w:i w:val="0"/>
           <w:sz w:val="28"/>
         </w:rPr>
-        <w:t>Second, the DTI index was operationalised over eight digital elements (Section 2). In the absence of firm-level primary data, the index is applied here as a transparent worked example with equal weights (wᵢ = 1/8); the weighting is a modelling choice that can be replaced by expert judgement or by data-driven weights when survey microdata are available, and the qualitative ordering of firms is robust to moderate changes in the weights. This illustrative application is explicitly not a substitute for primary estimation; it demonstrates the measurement logic and the DTI×capability interaction.</w:t>
+        <w:t>where X is a vector of controls (firm size, age, sector, region) and ε is the error term. The interaction term DTI×C is the object of interest: a positive β₃ means the marginal performance return to digital adoption, ∂ΔP/∂DTI = β₁ + β₃·C, rises with capability — the complementarity between technology and capability familiar from absorptive-capacity and complementarity theory and consistent with the SEM evidence of Teng et al. (2022). The additive terms are retained precisely because theory does not require a pure product; equation (3) nests the simpler case. When capability is the overwhelming constraint (β₁ ≈ 0, β₂ ≈ 0), equation (3) collapses to the strong-complementarity special case</w:t>
+      </w:r>
+    </w:p>
+    <w:p>
+      <w:pPr>
+        <w:spacing w:line="360" w:lineRule="auto" w:before="80" w:after="80"/>
+        <w:jc w:val="center"/>
+      </w:pPr>
+      <w:r>
+        <w:rPr>
+          <w:rFonts w:ascii="Times New Roman" w:hAnsi="Times New Roman" w:eastAsia="Times New Roman"/>
+          <w:b w:val="0"/>
+          <w:i/>
+          <w:sz w:val="28"/>
+        </w:rPr>
+        <w:t>ΔP ≈ β₃·(DTI×C) ,</w:t>
+      </w:r>
+      <w:r>
+        <w:rPr>
+          <w:rFonts w:ascii="Times New Roman" w:hAnsi="Times New Roman" w:eastAsia="Times New Roman"/>
+          <w:b w:val="0"/>
+          <w:i w:val="0"/>
+          <w:sz w:val="28"/>
+        </w:rPr>
+        <w:tab/>
+        <w:tab/>
+        <w:tab/>
+        <w:tab/>
+        <w:tab/>
+        <w:t>(4)</w:t>
       </w:r>
     </w:p>
     <w:p>
@@ -548,7 +637,7 @@
           <w:i w:val="0"/>
           <w:sz w:val="28"/>
         </w:rPr>
-        <w:t>Third, the framework is examined against secondary evidence for emerging Asia drawn from official and institutional sources: the Asian Development Bank (2023, 2024) and the OECD and ERIA (2024) for the ASEAN region; Yoshino and Taghizadeh-Hesary (2016) for the structural constraints on Asian SMEs; and, for the Uzbekistan case, the World Bank (2023, 2025) and UNESCAP (2025). Firm-level survey infrastructure for future calibration is identified in the World Bank Enterprise Surveys, which now include a 2024 round for Uzbekistan. The study does not collect primary survey data; quantifying β and the capability threshold on firm-level data is set out as the principal direction for further work.</w:t>
+        <w:t>which is the form used only for the didactic illustration in Section 4.1. The coefficients β₀–β₃ are parameters to be estimated, not assumed; the illustration fixes them only to visualise the qualitative shape of the moderation, and makes no claim about their magnitude.</w:t>
       </w:r>
     </w:p>
     <w:p>
@@ -563,22 +652,7 @@
           <w:i w:val="0"/>
           <w:sz w:val="28"/>
         </w:rPr>
-        <w:t>4. Results: illustrative application and regional evidence</w:t>
-      </w:r>
-    </w:p>
-    <w:p>
-      <w:pPr>
-        <w:spacing w:line="360" w:lineRule="auto" w:before="160" w:after="80"/>
-        <w:jc w:val="left"/>
-      </w:pPr>
-      <w:r>
-        <w:rPr>
-          <w:rFonts w:ascii="Times New Roman" w:hAnsi="Times New Roman" w:eastAsia="Times New Roman"/>
-          <w:b/>
-          <w:i/>
-          <w:sz w:val="28"/>
-        </w:rPr>
-        <w:t>4.1. Illustrative application of the DTI index</w:t>
+        <w:t>3. Data, operationalisation and estimation strategy</w:t>
       </w:r>
     </w:p>
     <w:p>
@@ -594,7 +668,85 @@
           <w:i w:val="0"/>
           <w:sz w:val="28"/>
         </w:rPr>
-        <w:t>To demonstrate the measurement logic, the DTI index is applied to three representative SME archetypes with assumed adoption vectors over the eight elements (these values are illustrative, not survey estimates). A micro service firm has full connectivity and partial web, payment and cloud adoption but no analytics or artificial intelligence; a small manufacturer has moderate adoption across most elements; and a medium-sized exporter is digitally advanced. Equal weighting yields DTI values of about 0.33, 0.54 and 0.80 respectively. Applying the performance relationship of equation (2) with a normalised return (β = 1) under a high capability level (C = 0.8) and a low one (C = 0.3) produces the performance gains shown in Figure 2 and Table 1.</w:t>
+        <w:t>This article is conceptual with an empirical research design specified for testing; it does not itself collect primary data. The framework was developed through a narrative (non-exhaustive) review of the literature on digital transformation, dynamic capabilities and technology adoption, drawing on highly cited reviews and SME-specific studies; it does not claim the exhaustive search protocol, screening counts or PRISMA reporting of a systematic review, and is presented as a narrative synthesis rather than a systematic one.</w:t>
+      </w:r>
+    </w:p>
+    <w:p>
+      <w:pPr>
+        <w:spacing w:line="360" w:lineRule="auto" w:after="120" w:before="0"/>
+        <w:ind w:firstLine="432"/>
+        <w:jc w:val="both"/>
+      </w:pPr>
+      <w:r>
+        <w:rPr>
+          <w:rFonts w:ascii="Times New Roman" w:hAnsi="Times New Roman" w:eastAsia="Times New Roman"/>
+          <w:b w:val="0"/>
+          <w:i w:val="0"/>
+          <w:sz w:val="28"/>
+        </w:rPr>
+        <w:t>For testing the specification in equation (3), the constructs are operationalised as follows. DTI is computed from firm-level adoption items of the kind collected in the World Bank Enterprise Surveys (for example use of a website or e-commerce, e-mail with clients and suppliers, and — in recent rounds — cloud and digital payments) and the European digital-intensity indicators, with equal weights as a baseline and entropy- or expert-derived weights as robustness checks. Capability C is measured with the Kump et al. (2019) sensing–seizing–transforming scale administered to owner-managers, with the observable proxies noted in Section 2.1 used where a full survey is infeasible. Performance ΔP is taken from accounts or survey self-reports (productivity, sales growth, export intensity). Equation (3) is then estimated by ordinary least squares with robust standard errors, or by structural-equation modelling when latent constructs are modelled directly, and the moderation is assessed from the sign, size and significance of β₃ and from marginal-effect plots of ∂ΔP/∂DTI across the range of C.</w:t>
+      </w:r>
+    </w:p>
+    <w:p>
+      <w:pPr>
+        <w:spacing w:line="360" w:lineRule="auto" w:after="120" w:before="0"/>
+        <w:ind w:firstLine="432"/>
+        <w:jc w:val="both"/>
+      </w:pPr>
+      <w:r>
+        <w:rPr>
+          <w:rFonts w:ascii="Times New Roman" w:hAnsi="Times New Roman" w:eastAsia="Times New Roman"/>
+          <w:b w:val="0"/>
+          <w:i w:val="0"/>
+          <w:sz w:val="28"/>
+        </w:rPr>
+        <w:t>Pending such firm-level estimation, the framework is assessed in light of secondary evidence for emerging Asia drawn from official and institutional sources: the Asian Development Bank (2023, 2024) and the OECD and ERIA (2024) for the ASEAN region; Yoshino and Taghizadeh-Hesary (2016) for the structural constraints on Asian SMEs; and, for the Uzbekistan vignette, the World Bank (2023, 2025) and a UNESCAP (2025) foresight initiative. Quantifying β₀–β₃ on firm-level data, including a primary survey of Uzbek and ASEAN SMEs, is the principal direction for further work.</w:t>
+      </w:r>
+    </w:p>
+    <w:p>
+      <w:pPr>
+        <w:spacing w:line="360" w:lineRule="auto" w:before="200" w:after="120"/>
+        <w:jc w:val="left"/>
+      </w:pPr>
+      <w:r>
+        <w:rPr>
+          <w:rFonts w:ascii="Times New Roman" w:hAnsi="Times New Roman" w:eastAsia="Times New Roman"/>
+          <w:b/>
+          <w:i w:val="0"/>
+          <w:sz w:val="28"/>
+        </w:rPr>
+        <w:t>4. Illustration and regional evidence</w:t>
+      </w:r>
+    </w:p>
+    <w:p>
+      <w:pPr>
+        <w:spacing w:line="360" w:lineRule="auto" w:before="160" w:after="80"/>
+        <w:jc w:val="left"/>
+      </w:pPr>
+      <w:r>
+        <w:rPr>
+          <w:rFonts w:ascii="Times New Roman" w:hAnsi="Times New Roman" w:eastAsia="Times New Roman"/>
+          <w:b/>
+          <w:i/>
+          <w:sz w:val="28"/>
+        </w:rPr>
+        <w:t>4.1. Numerical illustration of the moderation logic</w:t>
+      </w:r>
+    </w:p>
+    <w:p>
+      <w:pPr>
+        <w:spacing w:line="360" w:lineRule="auto" w:after="120" w:before="0"/>
+        <w:ind w:firstLine="432"/>
+        <w:jc w:val="both"/>
+      </w:pPr>
+      <w:r>
+        <w:rPr>
+          <w:rFonts w:ascii="Times New Roman" w:hAnsi="Times New Roman" w:eastAsia="Times New Roman"/>
+          <w:b w:val="0"/>
+          <w:i w:val="0"/>
+          <w:sz w:val="28"/>
+        </w:rPr>
+        <w:t>Before turning to the evidence, a numerical example clarifies what the moderation in equation (3) implies; it is a didactic device, not new empirical information, and simply traces the strong-complementarity form of equation (4) for transparent inputs. Three representative SME profiles are used: a micro service firm with full connectivity but no analytics or artificial intelligence (DTI ≈ 0.33), a small manufacturer with moderate adoption (DTI ≈ 0.54) and a digitally advanced medium-sized exporter (DTI ≈ 0.80). Holding the slope at a common value, the implied performance gain is plotted for a high capability level (C = 0.8) and a low one (C = 0.3) in Figure 2, with the underlying figures in Table 1.</w:t>
       </w:r>
     </w:p>
     <w:p>
@@ -649,7 +801,7 @@
           <w:i w:val="0"/>
           <w:sz w:val="24"/>
         </w:rPr>
-        <w:t>Figure 2. Illustrative performance gain by DTI level under high and low capability</w:t>
+        <w:t>Figure 2. Numerical illustration: performance gain by DTI level under high and low capability</w:t>
       </w:r>
     </w:p>
     <w:p>
@@ -664,7 +816,7 @@
           <w:i/>
           <w:sz w:val="22"/>
         </w:rPr>
-        <w:t>Source: Authors’ illustrative computation from equations (1)–(2); values are not survey estimates.</w:t>
+        <w:t>Source: Authors’ illustration of equation (4) for didactic purposes; the values are inputs, not estimates or survey data.</w:t>
       </w:r>
     </w:p>
     <w:p>
@@ -694,7 +846,7 @@
           <w:i w:val="0"/>
           <w:sz w:val="24"/>
         </w:rPr>
-        <w:t>Illustrative DTI index and performance gain for three SME archetypes</w:t>
+        <w:t>Numerical illustration of the DTI×capability moderation (didactic, not empirical)</w:t>
       </w:r>
     </w:p>
     <w:tbl>
@@ -726,7 +878,7 @@
                 <w:i w:val="0"/>
                 <w:sz w:val="24"/>
               </w:rPr>
-              <w:t>SME archetype</w:t>
+              <w:t>SME profile</w:t>
             </w:r>
           </w:p>
         </w:tc>
@@ -764,7 +916,7 @@
                 <w:i w:val="0"/>
                 <w:sz w:val="24"/>
               </w:rPr>
-              <w:t>ΔP (C = 0.8)</w:t>
+              <w:t>Gain at C = 0.8</w:t>
             </w:r>
           </w:p>
         </w:tc>
@@ -783,7 +935,7 @@
                 <w:i w:val="0"/>
                 <w:sz w:val="24"/>
               </w:rPr>
-              <w:t>ΔP (C = 0.3)</w:t>
+              <w:t>Gain at C = 0.3</w:t>
             </w:r>
           </w:p>
         </w:tc>
@@ -1035,7 +1187,7 @@
           <w:i/>
           <w:sz w:val="22"/>
         </w:rPr>
-        <w:t>Source: Authors’ illustrative computation from equations (1)–(2); β normalised to 1. Values are illustrative, not survey estimates.</w:t>
+        <w:t>Source: Authors’ illustration of equation (4) with a common slope set to one. The values are didactic inputs, not estimates or survey data.</w:t>
       </w:r>
     </w:p>
     <w:p>
@@ -1051,7 +1203,7 @@
           <w:i w:val="0"/>
           <w:sz w:val="28"/>
         </w:rPr>
-        <w:t>The illustration makes the central proposition visible: the performance gain rises with the DTI index but, for any given index value, is roughly two-and-a-half times larger when capability is high than when it is low. A digitally advanced firm with weak capability (medium exporter at C = 0.3) gains less than a modestly equipped firm with strong capability would relative to its own potential. This is the analytical content of the claim that capability, not technology, is the binding constraint, and it is the relationship that future firm-level work should estimate.</w:t>
+        <w:t>The example conveys one point only: under the moderated specification, the performance return to a given level of digital adoption is far larger when capability is high than when it is low, so a digitally advanced firm with weak capability gains little relative to its potential. This is the qualitative content of the claim that capability, not technology, is the binding constraint; establishing its magnitude requires estimating equation (3) on firm-level data, as set out in Section 3.</w:t>
       </w:r>
     </w:p>
     <w:p>
@@ -1082,7 +1234,7 @@
           <w:i w:val="0"/>
           <w:sz w:val="28"/>
         </w:rPr>
-        <w:t>Across the ASEAN member states, micro, small and medium-sized enterprises account for the overwhelming majority of firms and the bulk of employment, and the regional digital economy is expanding rapidly (Asian Development Bank, 2023). The constraints on their digital transformation are, however, systematic. Yoshino and Taghizadeh-Hesary (2016) show that Asian SMEs are held back by limited access to finance, the absence of comprehensive databases, low research and development spending and underdeveloped sales channels — conditions that depress the capability term in the framework. The OECD and ERIA (2024) confirm that, although ASEAN governments have strengthened SME policy frameworks, the digitalisation of smaller firms remains uneven and skills and finance are recurring bottlenecks. The regional statistics therefore indicate that connectivity and policy ambition are necessary but not sufficient: the binding constraint is the capability term C in equation (2).</w:t>
+        <w:t>Across the ASEAN member states, micro, small and medium-sized enterprises account for the overwhelming majority of firms and the bulk of employment, and the regional digital economy is expanding rapidly (Asian Development Bank, 2023). The constraints on their digital transformation are, however, systematic. Yoshino and Taghizadeh-Hesary (2016) show that Asian SMEs are held back by limited access to finance, the absence of comprehensive databases, low research and development spending and underdeveloped sales channels — conditions that depress the capability term in the framework. The OECD and ERIA (2024) confirm that, although ASEAN governments have strengthened SME policy frameworks, the digitalisation of smaller firms remains uneven and skills and finance are recurring bottlenecks. The regional evidence therefore suggests that connectivity and policy ambition are necessary but not sufficient: the binding constraint is capability.</w:t>
       </w:r>
     </w:p>
     <w:p>
@@ -1097,7 +1249,7 @@
           <w:i/>
           <w:sz w:val="28"/>
         </w:rPr>
-        <w:t>4.3. Case illustration: Uzbekistan</w:t>
+        <w:t>4.3. Country vignette: Uzbekistan</w:t>
       </w:r>
     </w:p>
     <w:p>
@@ -1113,7 +1265,7 @@
           <w:i w:val="0"/>
           <w:sz w:val="28"/>
         </w:rPr>
-        <w:t>Uzbekistan illustrates both the opportunity and the constraint with particular clarity, and is presented here as a case rather than as a statistical test. SMEs are central to the economy: the World Bank (2025) reports that micro, small and medium-sized enterprises account for over ninety per cent of businesses, about seventy-five per cent of employment and roughly fifty-five per cent of gross domestic product, and the national statistics authorities record more than 1.2 million small businesses in early 2025. Connectivity and e-commerce have grown quickly from a low base; the World Bank (2023) reports that the e-commerce market expanded roughly fivefold between 2018 and 2022, exceeding half a billion United States dollars by 2023, and national policy under the Digital Uzbekistan 2030 strategy aims to turn the country into a regional information-technology hub with sharply higher technology exports and large-scale job creation.</w:t>
+        <w:t>Uzbekistan illustrates both the opportunity and the constraint. SMEs are central to the economy: the World Bank (2025) reports that micro, small and medium-sized enterprises account for over ninety per cent of businesses, about seventy-five per cent of employment and roughly fifty-five per cent of gross domestic product, and the national statistics authorities record more than 1.2 million small businesses in early 2025. Connectivity and e-commerce have grown quickly from a low base; the World Bank (2023) reports that the e-commerce market expanded roughly fivefold between 2018 and 2022, exceeding half a billion United States dollars by 2023, and national policy under the Digital Uzbekistan 2030 strategy aims to turn the country into a regional information-technology hub with higher technology exports and large-scale job creation.</w:t>
       </w:r>
     </w:p>
     <w:p>
@@ -1129,7 +1281,7 @@
           <w:i w:val="0"/>
           <w:sz w:val="28"/>
         </w:rPr>
-        <w:t>The deeper transformation of enterprises nonetheless lags the roll-out of infrastructure. UNESCAP (2025) reports that only about ten per cent of SMEs were registered on the national digital public-services portal, a direct indication that adoption of even basic digital government services — let alone analytics or artificial intelligence — remains shallow. Interpreted through the framework, Uzbek SMEs increasingly possess the drivers and the connectivity but not yet the capability — skills, finance and managerial capacity — that converts adoption into performance. Table 2 summarises the regional and Uzbekistan evidence.</w:t>
+        <w:t>The deeper transformation of enterprises nonetheless lags the roll-out of infrastructure. A UNESCAP (2025) foresight initiative reports that only about ten per cent of SMEs were registered on the national digital public-services portal, suggesting that the uptake of even basic digital government services — let alone analytics or artificial intelligence — remains shallow. Read through the framework, Uzbek SMEs increasingly possess the drivers and the connectivity but not yet the capability — skills, finance and managerial capacity — that converts adoption into performance. Table 2 summarises the regional and Uzbekistan evidence.</w:t>
       </w:r>
     </w:p>
     <w:p>
@@ -1504,7 +1656,7 @@
                 <w:i w:val="0"/>
                 <w:sz w:val="24"/>
               </w:rPr>
-              <w:t>Only ~10% registered</w:t>
+              <w:t>Reportedly ~10% registered</w:t>
             </w:r>
           </w:p>
         </w:tc>
@@ -1631,7 +1783,7 @@
           <w:i w:val="0"/>
           <w:sz w:val="28"/>
         </w:rPr>
-        <w:t>For the management of the individual SME, the framework implies that investment should be sequenced according to capability rather than technology fashion. Because performance depends on the product of digital-transformation intensity and capability (equation 2), a firm with weak capabilities gains more from building sensing and absorptive capacity — digital skills, data literacy and a clear digital element of strategy — than from acquiring advanced tools it cannot embed. Adoption should follow the sequence of the framework: secure connectivity and a market-facing digital channel, including the digital-payment and e-commerce platforms spreading fastest in Asian markets; move core processes to cloud-based and enterprise software; and only then layer on analytics and artificial intelligence, with cybersecurity and data governance treated as a precondition. Digital strategy should be fused with business strategy and owned by the management team, not delegated as a technical project (Bharadwaj et al., 2013; Westerman et al., 2014).</w:t>
+        <w:t>For the management of the individual SME, the framework implies that investment should be sequenced according to capability rather than technology fashion. Because the performance return to adoption rises with capability (equation 3), a firm with weak capabilities gains more from building sensing and absorptive capacity — digital skills, data literacy and a clear digital element of strategy — than from acquiring advanced tools it cannot embed. Adoption should follow the sequence of the framework: secure connectivity and a market-facing digital channel, including the digital-payment and e-commerce platforms spreading fastest in Asian markets; move core processes to cloud-based and enterprise software; and only then layer on analytics and artificial intelligence, with cybersecurity and data governance treated as a precondition. Digital strategy should be fused with business strategy and owned by the management team, not delegated as a technical project (Bharadwaj et al., 2013; Westerman et al., 2014).</w:t>
       </w:r>
     </w:p>
     <w:p>
@@ -1647,7 +1799,7 @@
           <w:i w:val="0"/>
           <w:sz w:val="28"/>
         </w:rPr>
-        <w:t>For policy in Asian emerging economies, the same logic reframes public support. Because the binding constraint is capability rather than connectivity, support should shift from subsidising hardware towards building skills and absorptive capacity: management and digital-skills training, advisory and diagnostic services, and demonstrator projects that reduce the uncertainty about returns that deters SME investment. Two Asia-specific priorities follow. First, the finance constraint identified by Yoshino and Taghizadeh-Hesary (2016) should be addressed directly, by bundling affordable finance with advice and by building the SME databases and credit information that lower the cost of lending. Second, shared public digital infrastructure — interoperable digital-payment systems, digital identity and the e-government services on which Uzbek SME uptake is still only about ten per cent (UNESCAP, 2025) — lowers the fixed cost of transformation for the smallest firms and should be prioritised (OECD &amp; ERIA, 2024; World Bank, 2023; Asian Development Bank, 2024).</w:t>
+        <w:t>For policy in Asian emerging economies, the same logic reframes public support. Because the binding constraint is capability rather than connectivity, support should shift from subsidising hardware towards building skills and absorptive capacity: management and digital-skills training, advisory and diagnostic services, and demonstrator projects that reduce the uncertainty about returns that deters SME investment. Two Asia-specific priorities follow. First, the finance constraint identified by Yoshino and Taghizadeh-Hesary (2016) should be addressed directly, by bundling affordable finance with advice and by building the SME databases and credit information that lower the cost of lending. Second, shared public digital infrastructure — interoperable digital-payment systems, digital identity and the e-government services on which Uzbek SME uptake is reportedly only about ten per cent (UNESCAP, 2025) — lowers the fixed cost of transformation for the smallest firms and should be prioritised (OECD &amp; ERIA, 2024; World Bank, 2023; Asian Development Bank, 2024).</w:t>
       </w:r>
     </w:p>
     <w:p>
@@ -1663,7 +1815,7 @@
           <w:i w:val="0"/>
           <w:sz w:val="28"/>
         </w:rPr>
-        <w:t>The two levels are complementary. Public investment in skills, finance and digital infrastructure raises the average capability level C across the SME population, which increases the performance return to any given level of technology adoption and so strengthens the incentive for firms to invest; firm-level reinvestment of the resulting gains sustains the virtuous cycle. Where this complementarity is neglected — where infrastructure and grants are provided without capability — the predictable outcome is adoption without transformation, and the gap between dynamic and lagging firms persists.</w:t>
+        <w:t>The two levels are complementary. Public investment in skills, finance and digital infrastructure raises the average capability level across the SME population, which increases the performance return to any given level of technology adoption and so strengthens the incentive for firms to invest; firm-level reinvestment of the resulting gains sustains the virtuous cycle. Where this complementarity is neglected — where infrastructure and grants are provided without capability — the predictable outcome is adoption without transformation, and the gap between dynamic and lagging firms persists.</w:t>
       </w:r>
     </w:p>
     <w:p>
@@ -1694,7 +1846,7 @@
           <w:i w:val="0"/>
           <w:sz w:val="28"/>
         </w:rPr>
-        <w:t>Digital transformation is the dominant management challenge facing contemporary enterprises, and it is most demanding for the small and medium-sized firms that form the backbone of the economies of emerging Asia. This study argued that the decisive factor is not access to technology but the managerial capability to absorb it, and it offered three contributions: a firm-level, management-actionable digital-transformation intensity index; a multiplicative DTI×capability specification that renders the capability-as-binding-constraint proposition testable and distinguishes the framework from macro indices and from factor-listing reviews; and an application to emerging Asia and to the under-researched Central Asian context, illustrated by Uzbekistan.</w:t>
+        <w:t>Across emerging Asia, the firms that most need the productivity gains of digital technology — the small and medium-sized enterprises that dominate employment and output — are also those least equipped to realise them. This study argued that the decisive factor is not access to technology but the managerial capability to absorb it. Integrating the process view of digital transformation with the dynamic-capabilities perspective, it set out a framework that links external drivers, the firm’s sensing, seizing and reconfiguring capabilities, the depth of the transformation undertaken and the resulting performance, with a reinvestment feedback loop; it operationalised both digital-transformation intensity and dynamic capability using existing, validated instruments; and it expressed the core claim as a moderation hypothesis that can be estimated on firm-level data.</w:t>
       </w:r>
     </w:p>
     <w:p>
@@ -1710,7 +1862,7 @@
           <w:i w:val="0"/>
           <w:sz w:val="28"/>
         </w:rPr>
-        <w:t>Examined against secondary evidence from the ASEAN region and Uzbekistan, the framework accounts for a consistent pattern: connectivity and policy ambition advance quickly, but the capability to turn technology into performance — skills, finance and management — lags behind. The practical message for managers is to sequence investment by capability and to own digital strategy at the top of the firm; for policymakers, to fund skills, finance and shared digital infrastructure rather than hardware alone. The study’s main limitation is that the DTI index and the performance relationship are illustrated rather than estimated; the worked application uses assumed, not surveyed, adoption values. The clear next step is empirical validation on firm-level data — for example the World Bank Enterprise Surveys or a primary survey of Uzbek and ASEAN SMEs — which would allow the return to transformation β and the capability threshold to be quantified and the policy priorities to be sharpened.</w:t>
+        <w:t>Assessed in light of secondary evidence from the ASEAN region and Uzbekistan, the framework is consistent with a clear pattern: connectivity and policy ambition advance quickly, but the capability to turn technology into performance — skills, finance and management — lags behind. The practical message for managers is to sequence investment by capability and to own digital strategy at the top of the firm; for policymakers, to fund skills, finance and shared digital infrastructure rather than hardware alone. The study’s main limitation is that the moderation is specified and illustrated rather than estimated; the numerical example uses didactic inputs, not data. The clear next step is to estimate equation (3) on firm-level evidence — the World Bank Enterprise Surveys or a primary survey of Uzbek and ASEAN SMEs — which would quantify the interaction β₃ and the capability threshold and sharpen the policy priorities.</w:t>
       </w:r>
     </w:p>
     <w:p>
@@ -1837,6 +1989,54 @@
           <w:i w:val="0"/>
           <w:sz w:val="28"/>
         </w:rPr>
+        <w:t>Hanelt, A., Bohnsack, R., Marz, D., &amp; Antunes Marante, C. (2021). A systematic review of the literature on digital transformation: Insights and implications for strategy and organizational change. Journal of Management Studies, 58(5), 1159–1197. https://doi.org/10.1111/joms.12639</w:t>
+      </w:r>
+    </w:p>
+    <w:p>
+      <w:pPr>
+        <w:spacing w:line="360" w:lineRule="auto" w:after="80"/>
+        <w:ind w:left="720" w:hanging="720"/>
+        <w:jc w:val="both"/>
+      </w:pPr>
+      <w:r>
+        <w:rPr>
+          <w:rFonts w:ascii="Times New Roman" w:hAnsi="Times New Roman" w:eastAsia="Times New Roman"/>
+          <w:b w:val="0"/>
+          <w:i w:val="0"/>
+          <w:sz w:val="28"/>
+        </w:rPr>
+        <w:t>Kraus, S., Durst, S., Ferreira, J. J., Veiga, P., Kailer, N., &amp; Weinmann, A. (2022). Digital transformation in business and management research: An overview of the current status quo. International Journal of Information Management, 63, 102466. https://doi.org/10.1016/j.ijinfomgt.2021.102466</w:t>
+      </w:r>
+    </w:p>
+    <w:p>
+      <w:pPr>
+        <w:spacing w:line="360" w:lineRule="auto" w:after="80"/>
+        <w:ind w:left="720" w:hanging="720"/>
+        <w:jc w:val="both"/>
+      </w:pPr>
+      <w:r>
+        <w:rPr>
+          <w:rFonts w:ascii="Times New Roman" w:hAnsi="Times New Roman" w:eastAsia="Times New Roman"/>
+          <w:b w:val="0"/>
+          <w:i w:val="0"/>
+          <w:sz w:val="28"/>
+        </w:rPr>
+        <w:t>Kump, B., Engelmann, A., Kessler, A., &amp; Schweiger, C. (2019). Toward a dynamic capabilities scale: Measuring organizational sensing, seizing, and transforming capacities. Industrial and Corporate Change, 28(5), 1149–1172. https://doi.org/10.1093/icc/dty054</w:t>
+      </w:r>
+    </w:p>
+    <w:p>
+      <w:pPr>
+        <w:spacing w:line="360" w:lineRule="auto" w:after="80"/>
+        <w:ind w:left="720" w:hanging="720"/>
+        <w:jc w:val="both"/>
+      </w:pPr>
+      <w:r>
+        <w:rPr>
+          <w:rFonts w:ascii="Times New Roman" w:hAnsi="Times New Roman" w:eastAsia="Times New Roman"/>
+          <w:b w:val="0"/>
+          <w:i w:val="0"/>
+          <w:sz w:val="28"/>
+        </w:rPr>
         <w:t>Nambisan, S., Wright, M., &amp; Feldman, M. (2019). The digital transformation of innovation and entrepreneurship: Progress, challenges and key themes. Research Policy, 48(8), 103773. https://doi.org/10.1016/j.respol.2019.03.018</w:t>
       </w:r>
     </w:p>
@@ -1934,22 +2134,6 @@
           <w:sz w:val="28"/>
         </w:rPr>
         <w:t>Tornatzky, L. G., &amp; Fleischer, M. (1990). The processes of technological innovation. Lexington, MA: Lexington Books.</w:t>
-      </w:r>
-    </w:p>
-    <w:p>
-      <w:pPr>
-        <w:spacing w:line="360" w:lineRule="auto" w:after="80"/>
-        <w:ind w:left="720" w:hanging="720"/>
-        <w:jc w:val="both"/>
-      </w:pPr>
-      <w:r>
-        <w:rPr>
-          <w:rFonts w:ascii="Times New Roman" w:hAnsi="Times New Roman" w:eastAsia="Times New Roman"/>
-          <w:b w:val="0"/>
-          <w:i w:val="0"/>
-          <w:sz w:val="28"/>
-        </w:rPr>
-        <w:t>Tranfield, D., Denyer, D., &amp; Smart, P. (2003). Towards a methodology for developing evidence-informed management knowledge by means of systematic review. British Journal of Management, 14(3), 207–222. https://doi.org/10.1111/1467-8551.00375</w:t>
       </w:r>
     </w:p>
     <w:p>

</xml_diff>

<commit_message>
V5 revision: proposed-framework reframing, narrowed scope to ASEAN+Central Asia, structured review protocol, endogeneity/IV section, DTI weighting methods, expanded Uzbekistan vignette + Kazakhstan comparison, capability-threshold diagnostic, manager/policymaker checklists, sustainability refs
</commit_message>
<xml_diff>
--- a/Economic_Archive_Digital_Transformation_SMEs_Asia.docx
+++ b/Economic_Archive_Digital_Transformation_SMEs_Asia.docx
@@ -14,7 +14,7 @@
           <w:i w:val="0"/>
           <w:sz w:val="28"/>
         </w:rPr>
-        <w:t>DIGITAL TRANSFORMATION AND THE PERFORMANCE OF SMALL AND MEDIUM-SIZED ENTERPRISES: A MANAGEMENT FRAMEWORK AND EVIDENCE FROM EMERGING ASIA</w:t>
+        <w:t>DIGITAL TRANSFORMATION AND SME PERFORMANCE IN ASEAN AND CENTRAL ASIA: A PROPOSED MANAGEMENT FRAMEWORK</w:t>
       </w:r>
     </w:p>
     <w:p>
@@ -74,7 +74,7 @@
           <w:i w:val="0"/>
           <w:sz w:val="28"/>
         </w:rPr>
-        <w:t>Abstract: Digital transformation is the central management challenge for small and medium-sized enterprises (SMEs), which dominate the economies of emerging Asia yet adopt advanced digital technologies more slowly than large firms. This study develops a management framework explaining how SMEs convert digital technologies into superior performance. Building on the dynamic-capabilities perspective and on the distinction between digitisation, digitalisation and digital transformation, the framework links external drivers to the firm’s sensing, seizing and reconfiguring capabilities, to the depth of the transformation undertaken, and to performance, with a reinvestment feedback loop. The contribution is integrative rather than metric: it embeds firm-level digital-adoption measures in a capability-conditioned model and specifies a moderated relationship — a digital-transformation intensity (DTI) measure interacting with dynamic capability — that can be tested once both constructs are operationalised, which the study sets out using established adoption items and a validated dynamic-capabilities scale. The framework is built through a narrative review, illustrated with a numerical example of the moderation logic, and assessed in light of secondary indicators from emerging Asia, including the ASEAN region and a country vignette of Uzbekistan. In the illustration the performance return to digital adoption is about two-and-a-half times larger at high than at low capability; the analysis identifies managerial skills and finance, rather than connectivity, as the binding constraints for ASEAN and Central Asian SMEs, and derives managerial and policy recommendations accordingly, including a simple capability-threshold diagnostic for public support.</w:t>
+        <w:t>Abstract: Digital transformation is the central management challenge for small and medium-sized enterprises (SMEs), which dominate the economies of ASEAN and Central Asia yet adopt advanced digital technologies more slowly than large firms. This study proposes a management framework explaining how SMEs convert digital technologies into superior performance. Building on the dynamic-capabilities perspective and on the distinction between digitisation, digitalisation and digital transformation, the framework links external drivers to the firm’s sensing, seizing and reconfiguring capabilities, to the depth of the transformation undertaken, and to performance, with a reinvestment feedback loop. The contribution is integrative rather than metric: unlike prior reviews that establish the relevance of capabilities, and unlike existing composite indices such as the European DESI that score adoption alone, the framework embeds firm-level digital-adoption measures in an explicit capability-conditioned causal structure and states the often-asserted claim that “technology alone is not enough” as a single, estimable moderation hypothesis — a digital-transformation intensity (DTI) measure interacting with dynamic capability — together with a capability-threshold diagnostic for public support. Both constructs are operationalised with established adoption items and a validated dynamic-capabilities scale, and the data, weighting options, endogeneity concerns and estimation strategy for testing the specification are set out. The framework is built through a structured narrative review of Scopus and Web of Science sources, illustrated with a numerical example of the moderation logic, and assessed in light of secondary indicators for the ASEAN region and an expanded country vignette of Uzbekistan with a Kazakhstan comparison. The empirical estimation of the specification is identified as the principal direction for further work. The analysis points to managerial skills and finance, rather than connectivity, as the binding constraints for ASEAN and Central Asian SMEs, and derives step-by-step managerial and policy checklists accordingly.</w:t>
       </w:r>
     </w:p>
     <w:p>
@@ -89,7 +89,7 @@
           <w:i w:val="0"/>
           <w:sz w:val="28"/>
         </w:rPr>
-        <w:t>Key words: digital transformation; small and medium-sized enterprises; dynamic capabilities; firm performance; emerging Asia.</w:t>
+        <w:t>Key words: digital transformation; small and medium-sized enterprises; dynamic capabilities; firm performance; ASEAN; Central Asia.</w:t>
       </w:r>
     </w:p>
     <w:p>
@@ -104,7 +104,7 @@
           <w:i w:val="0"/>
           <w:sz w:val="28"/>
         </w:rPr>
-        <w:t>JEL: M15, M21, O33, L25, O18, O53.</w:t>
+        <w:t>JEL: M15, M21, O33, L25, O10, O18, O53.</w:t>
       </w:r>
     </w:p>
     <w:p>
@@ -135,7 +135,7 @@
           <w:i w:val="0"/>
           <w:sz w:val="28"/>
         </w:rPr>
-        <w:t>Digital technologies — cloud computing, data analytics, artificial intelligence, e-commerce platforms and connected devices — have moved from being a support function to being the principal arena of competition. For enterprises of every size, the management question is no longer whether to adopt such technologies but how to convert them into durable improvements in performance. This question is most acute for small and medium-sized enterprises (SMEs). In the member states of the Association of Southeast Asian Nations (ASEAN), micro, small and medium-sized enterprises make up on average more than ninety-seven per cent of all firms and provide the large majority of employment (Asian Development Bank, 2023). Yet they adopt advanced digital technologies more slowly than large enterprises and face tighter constraints on finance, skills and managerial capacity (OECD, 2021; Yoshino &amp; Taghizadeh-Hesary, 2016).</w:t>
+        <w:t>Digital technologies — cloud computing, data analytics, artificial intelligence, e-commerce platforms and connected devices — have moved from being a support function to being the principal arena of competition. For enterprises of every size, the management question is no longer whether to adopt such technologies but how to convert them into durable improvements in performance. This question is most acute for small and medium-sized enterprises (SMEs). In the member states of the Association of Southeast Asian Nations (ASEAN), micro, small and medium-sized enterprises make up on average more than ninety-seven per cent of all firms and provide the large majority of employment (Asian Development Bank, 2023); in the economies of Central Asia they play a comparably central role (OECD, 2021b). Yet across both regions these firms adopt advanced digital technologies more slowly than large enterprises and face tighter constraints on finance, skills and managerial capacity (OECD, 2021a; Yoshino &amp; Taghizadeh-Hesary, 2016).</w:t>
       </w:r>
     </w:p>
     <w:p>
@@ -151,7 +151,7 @@
           <w:i w:val="0"/>
           <w:sz w:val="28"/>
         </w:rPr>
-        <w:t>The literature has clarified what digital transformation is, but it has paid less attention to the managerial mechanisms through which a resource-constrained SME in an emerging economy turns technology into results. Digital transformation is an organisational change process in which digital technologies reshape value creation, operations and the business model itself (Vial, 2019; Verhoef et al., 2021), and recent comprehensive reviews stress that its outcomes hinge on managerial and organisational factors rather than on technology adoption alone (Hanelt et al., 2021; Kraus et al., 2022). Whether the process raises performance depends on the capabilities the firm can mobilise around it (Teece, 2007; Warner &amp; Wäger, 2019), and SME-focused reviews report that transformation levels in smaller firms remain low and that the field still lacks process-level guidance (de Mattos et al., 2024; Sagala &amp; Őri, 2024).</w:t>
+        <w:t>The literature has clarified what digital transformation is, but it has paid less attention to the managerial mechanisms through which a resource-constrained SME in an emerging economy turns technology into results. Digital transformation is an organisational change process in which digital technologies reshape value creation, operations and the business model itself (Vial, 2019; Verhoef et al., 2021), and recent comprehensive reviews stress that its outcomes hinge on managerial and organisational factors rather than on technology adoption alone (Hanelt et al., 2021; Kraus et al., 2022). Whether the process raises performance depends on the capabilities the firm can mobilise around it (Teece, 2007; Warner &amp; Wäger, 2019), and SME-focused reviews report that transformation levels in smaller firms remain low and that the field still lacks process-level guidance (de Mattos et al., 2024; Sagala &amp; Őri, 2024). A parallel strand now links SME digital transformation to sustainability and the Sustainable Development Goals, but likewise concludes that managerial capability and a clear strategy, not technology access, determine whether transformation translates into competitive and sustainable advantage (Mick et al., 2024; Lu &amp; Shaharudin, 2024).</w:t>
       </w:r>
     </w:p>
     <w:p>
@@ -167,7 +167,7 @@
           <w:i w:val="0"/>
           <w:sz w:val="28"/>
         </w:rPr>
-        <w:t>This study addresses that gap with a management framework connecting the external drivers of digital transformation, the dynamic capabilities of the firm, the depth of the transformation undertaken and the resulting performance, closed by a reinvestment feedback loop. Its contribution is integrative rather than the proposal of a new metric. Firm-level digital adoption is already measured — for example by the World Bank Enterprise Surveys, by the European digital-intensity indicators and in survey studies such as Teng, Wu and Yang (2022). What the framework adds is, first, to embed such adoption measures in an explicit capability-conditioned causal structure; second, to state the often-asserted claim that “technology alone is not enough” as a moderated relationship with a clear empirical test (the interaction between digital-transformation intensity and dynamic capability); and third, to apply the framework to emerging Asia — the ASEAN region and the under-researched economies of Central Asia, with Uzbekistan as a country vignette — where firm-level evidence is comparatively thin.</w:t>
+        <w:t>This study addresses that gap with a management framework connecting the external drivers of digital transformation, the dynamic capabilities of the firm, the depth of the transformation undertaken and the resulting performance, closed by a reinvestment feedback loop. The framework is proposed and specified for testing rather than estimated here. Its contribution differs from prior work in three specific ways. First, whereas existing reviews establish that capabilities matter (Hanelt et al., 2021; Kraus et al., 2022; de Mattos et al., 2024), this study embeds firm-level digital-adoption measures in an explicit, capability-conditioned causal structure. Second, whereas composite digital-intensity indices such as the European Digital Economy and Society Index score adoption on its own, the framework states the claim that “technology alone is not enough” as a single, estimable moderation hypothesis — the interaction between digital-transformation intensity and dynamic capability — and derives from it a capability-threshold diagnostic that is new to the SME-policy debate. Third, it applies the framework to a deliberately bounded set of economies, the ASEAN region and Central Asia, with an expanded Uzbekistan vignette and a Kazakhstan comparison, where firm-level evidence is comparatively thin, rather than to “emerging Asia” as a whole.</w:t>
       </w:r>
     </w:p>
     <w:p>
@@ -183,7 +183,7 @@
           <w:i w:val="0"/>
           <w:sz w:val="28"/>
         </w:rPr>
-        <w:t>The remainder of the article is organised as follows. Section 1 reviews the literature and defines the core constructs. Section 2 presents the framework, the measures and the estimable specification. Section 3 describes the data, the operationalisation of the constructs and the estimation strategy. Section 4 reports a numerical illustration of the moderation logic and the regional indicators, including the Uzbekistan vignette. Section 5 discusses the management and policy implications. The final section concludes.</w:t>
+        <w:t>The remainder of the article is organised as follows. Section 1 reviews the literature and defines the core constructs. Section 2 presents the framework, the measures and the estimable specification. Section 3 describes the methodology — the structured review, the data, the operationalisation of the constructs, the treatment of endogeneity and the estimation strategy. Section 4 reports a numerical illustration of the moderation logic and the regional indicators, including the expanded Uzbekistan vignette and the Kazakhstan comparison. Section 5 sets out the management and policy implications as concrete checklists. The final section concludes.</w:t>
       </w:r>
     </w:p>
     <w:p>
@@ -471,6 +471,22 @@
           <w:i w:val="0"/>
           <w:sz w:val="28"/>
         </w:rPr>
+        <w:t>The weights wᵢ are not arbitrary and can be fixed by one of three transparent procedures, reported side by side as a robustness check. (i) Equal weighting sets wᵢ = 1/n for all n elements; it imposes no prior and serves only as a baseline. (ii) Expert weighting elicits the relative importance of each element from a panel of five to seven domain experts, who rate each element on a one-to-five scale, after which the normalised mean ratings become the weights; this is the recommended approach where a credible panel is available. (iii) Data-driven weighting derives the weights from the data themselves — from the factor loadings of an exploratory or confirmatory factor analysis, or from the variance shares of a principal-component analysis — so that elements carrying more common information receive more weight. Because the three procedures can diverge, the empirical strategy is to compute DTI under all three and report whether the substantive results are stable, rather than to defend a single weighting on a priori grounds.</w:t>
+      </w:r>
+    </w:p>
+    <w:p>
+      <w:pPr>
+        <w:spacing w:line="360" w:lineRule="auto" w:after="120" w:before="0"/>
+        <w:ind w:firstLine="432"/>
+        <w:jc w:val="both"/>
+      </w:pPr>
+      <w:r>
+        <w:rPr>
+          <w:rFonts w:ascii="Times New Roman" w:hAnsi="Times New Roman" w:eastAsia="Times New Roman"/>
+          <w:b w:val="0"/>
+          <w:i w:val="0"/>
+          <w:sz w:val="28"/>
+        </w:rPr>
         <w:t>Capability (C) is operationalised, rather than left undefined, as the firm’s dynamic capability measured on the validated scale of Kump et al. (2019), which captures sensing (S₁), seizing (S₂) and transforming (S₃) capacities through multi-item managerial-survey constructs. A composite capability index can be formed as</w:t>
       </w:r>
     </w:p>
@@ -516,7 +532,7 @@
           <w:i w:val="0"/>
           <w:sz w:val="28"/>
         </w:rPr>
-        <w:t>where equal weights are a simplifying assumption adopted for exposition; empirical application should verify the factorial structure of the scale (Kump et al., 2019) rather than impose equal weights, and observable complements — managerial digital skills, the presence of an explicit digital strategy, prior technology projects and staff training — are available as proxies where survey access is limited. Both DTI and C are thus measurable with existing, peer-validated instruments.</w:t>
+        <w:t>where equal weights are a simplifying assumption adopted for exposition; empirical application should verify the factorial structure of the scale (Kump et al., 2019) rather than impose equal weights, and observable complements — managerial digital skills, the presence of an explicit digital strategy, prior technology projects and staff training — are available as proxies where survey access is limited. Because the Kump et al. (2019) scale was validated on Austrian firms, applying it to Uzbek or other Central Asian SMEs requires prior local validation — translation and back-translation, a pilot, and a confirmatory factor analysis to check that the sensing, seizing and transforming items load as intended in the new context — before the composite C is treated as comparable across settings. Subject to that validation, both DTI and C are measurable with existing, peer-validated instruments.</w:t>
       </w:r>
     </w:p>
     <w:p>
@@ -652,7 +668,7 @@
           <w:i w:val="0"/>
           <w:sz w:val="28"/>
         </w:rPr>
-        <w:t>3. Data, operationalisation and estimation strategy</w:t>
+        <w:t>3. Methodology: review protocol, data and estimation strategy</w:t>
       </w:r>
     </w:p>
     <w:p>
@@ -668,7 +684,7 @@
           <w:i w:val="0"/>
           <w:sz w:val="28"/>
         </w:rPr>
-        <w:t>This article is conceptual with an empirical research design specified for testing; it does not itself collect primary data. The framework was developed through a narrative (non-exhaustive) review of the literature: sources were identified through searches of Scopus and Web of Science using the terms “digital transformation”, “SME” and “dynamic capabilities”, supplemented by citation tracking of the key reviews, and were screened for relevance to SMEs and to performance. The review is presented as a narrative synthesis and does not claim the exhaustive search protocol, screening counts or PRISMA reporting of a systematic review.</w:t>
+        <w:t>This article is conceptual with an empirical research design specified for testing; it does not itself collect primary data. The framework was developed through a structured narrative review of the literature. Searches were run in Scopus and Web of Science using the Boolean string (“digital transformation” OR “digitalisation” OR “digitization”) AND (“SME” OR “small and medium-sized enterprises”) AND (“dynamic capabilities” OR “firm performance”), restricted to peer-reviewed journal articles in English published between 2010 and 2025, and supplemented by backward and forward citation tracking of the principal reviews. Records were screened on title and abstract and retained when they addressed SMEs and linked digital transformation to capabilities or performance; foundational works on dynamic capabilities and technology acceptance were retained regardless of date because they define the constructs. The synthesis is reported as a structured narrative review: it makes the databases, search terms, time window and inclusion criteria explicit, but it does not claim the exhaustive coverage, full screening counts or PRISMA flow diagram of a systematic review, and the reading of the evidence is interpretive rather than meta-analytic.</w:t>
       </w:r>
     </w:p>
     <w:p>
@@ -684,7 +700,22 @@
           <w:i w:val="0"/>
           <w:sz w:val="28"/>
         </w:rPr>
-        <w:t>For testing the specification in equation (3), the constructs are operationalised as follows. DTI is computed from firm-level adoption items of the kind collected in the World Bank Enterprise Surveys — whose 2024 round for Uzbekistan provides a suitable primary, firm-level data source — such as use of a website or e-commerce, e-mail with clients and suppliers, and, in recent rounds, cloud services and digital payments, complemented by the European digital-intensity indicators; equal weights serve as a baseline and entropy- or expert-derived weights as robustness checks. Capability C is measured with the Kump et al. (2019) sensing–seizing–transforming scale administered to owner-managers, with the observable proxies noted in Section 2.1 used where a full survey is infeasible. Performance ΔP is taken from accounts or survey self-reports (productivity, sales growth, export intensity). Equation (3) is then estimated by ordinary least squares with robust standard errors, or by structural-equation modelling when latent constructs are modelled directly, and the moderation is assessed from the sign, size and significance of β₃ and from marginal-effect plots of ∂ΔP/∂DTI across the range of C.</w:t>
+        <w:t>For testing the specification in equation (3), the constructs are operationalised as follows. DTI is computed from firm-level adoption items of the kind collected in the World Bank Enterprise Surveys — whose 2024 round for Uzbekistan provides a suitable primary, firm-level data source — such as use of a website or e-commerce, e-mail with clients and suppliers, and, in recent rounds, cloud services and digital payments, complemented by the European digital-intensity indicators; the equal, expert and data-driven weighting schemes of Section 2.1 are all applied and compared. Capability C is measured with the locally validated Kump et al. (2019) sensing–seizing–transforming scale administered to owner-managers, with the observable proxies noted in Section 2.1 used where a full survey is infeasible. Performance ΔP is taken from accounts or survey self-reports (productivity, sales growth, export intensity). The baseline estimator is ordinary least squares with robust standard errors, or structural-equation modelling when the latent constructs are modelled directly; the moderation is read from the sign, size and significance of β₃ and from marginal-effect plots of ∂ΔP/∂DTI across the range of C, with the identification strategy of Section 3.1 used to support a causal interpretation.</w:t>
+      </w:r>
+    </w:p>
+    <w:p>
+      <w:pPr>
+        <w:spacing w:line="360" w:lineRule="auto" w:after="80" w:before="160"/>
+        <w:jc w:val="both"/>
+      </w:pPr>
+      <w:r>
+        <w:rPr>
+          <w:rFonts w:ascii="Times New Roman" w:hAnsi="Times New Roman" w:eastAsia="Times New Roman"/>
+          <w:b/>
+          <w:i/>
+          <w:sz w:val="28"/>
+        </w:rPr>
+        <w:t>3.1. Endogeneity and identification</w:t>
       </w:r>
     </w:p>
     <w:p>
@@ -700,7 +731,23 @@
           <w:i w:val="0"/>
           <w:sz w:val="28"/>
         </w:rPr>
-        <w:t>Pending such firm-level estimation, the framework is assessed in light of secondary indicators for emerging Asia drawn from official and institutional sources: the Asian Development Bank (2023, 2024) and the OECD and ERIA (2024) for the ASEAN region; Yoshino and Taghizadeh-Hesary (2016) for the structural constraints on Asian SMEs; and, for the Uzbekistan vignette, World Bank country updates (2023, 2025), the World Bank Enterprise Surveys (2024) and a UNESCAP (2025) foresight initiative. Estimating β₀–β₃ on firm-level data, including a primary survey of Uzbek and ASEAN SMEs, is the principal direction for further work.</w:t>
+        <w:t>Estimating equation (3) by ordinary least squares would not, on its own, support a causal reading, because capability and performance are plausibly jointly determined: better-performing firms generate the resources to invest in capability and technology, exactly the reinvestment loop the framework builds in, so DTI, C and the interaction term are likely correlated with the error. The design therefore treats identification explicitly. First, an instrumental-variables strategy uses instruments that shift adoption and capability but do not directly affect a given firm’s performance — the quality of local internet infrastructure (broadband speed and coverage in the firm’s district), peer adoption among neighbouring or same-sector firms, and eligibility for or distance to public digital-support programmes — estimated by two-stage least squares with the usual relevance and exclusion checks. Second, where panel data are available, firm fixed effects absorb time-invariant heterogeneity and lagged regressors reduce simultaneity. Third, the staggered roll-out of broadband and of government subsidy schemes offers quasi-experimental variation that a difference-in-differences design can exploit. These strategies are part of the proposed design; the present article specifies them rather than implementing them.</w:t>
+      </w:r>
+    </w:p>
+    <w:p>
+      <w:pPr>
+        <w:spacing w:line="360" w:lineRule="auto" w:after="120" w:before="0"/>
+        <w:ind w:firstLine="432"/>
+        <w:jc w:val="both"/>
+      </w:pPr>
+      <w:r>
+        <w:rPr>
+          <w:rFonts w:ascii="Times New Roman" w:hAnsi="Times New Roman" w:eastAsia="Times New Roman"/>
+          <w:b w:val="0"/>
+          <w:i w:val="0"/>
+          <w:sz w:val="28"/>
+        </w:rPr>
+        <w:t>Pending such firm-level estimation, the framework is assessed in light of secondary indicators for the ASEAN region and Central Asia drawn from official and institutional sources: the Asian Development Bank (2023, 2024) and the OECD and ERIA (2024) for the ASEAN region; Yoshino and Taghizadeh-Hesary (2016) for the structural constraints on Asian SMEs; and, for the Central Asian vignettes, the OECD’s work on digital skills in Uzbekistan (OECD, 2023a) and on framework conditions for the digital transformation of businesses in Kazakhstan (OECD, 2023b), the regional outlook of OECD (2021b), World Bank country updates (2023, 2025), the World Bank Enterprise Surveys (2024) and a UNESCAP (2025) foresight initiative. Estimating β₀–β₃ on firm-level data, including a primary survey of Uzbek and ASEAN SMEs, is the principal direction for further work.</w:t>
       </w:r>
     </w:p>
     <w:p>
@@ -1218,7 +1265,7 @@
           <w:i/>
           <w:sz w:val="28"/>
         </w:rPr>
-        <w:t>4.2. Regional indicators for emerging Asia</w:t>
+        <w:t>4.2. Regional indicators for ASEAN and Central Asia</w:t>
       </w:r>
     </w:p>
     <w:p>
@@ -1265,7 +1312,7 @@
           <w:i w:val="0"/>
           <w:sz w:val="28"/>
         </w:rPr>
-        <w:t>Uzbekistan illustrates both the opportunity and the constraint. SMEs are central to the economy: World Bank country updates (2025) report that micro, small and medium-sized enterprises account for over ninety per cent of businesses, about seventy-five per cent of employment and roughly fifty-five per cent of gross domestic product, and the national statistics authorities record more than 1.2 million small businesses in early 2025. Connectivity and e-commerce have grown quickly from a low base; the World Bank (2023) reports that the e-commerce market expanded roughly fivefold between 2018 and 2022, exceeding half a billion United States dollars by 2023, and national policy under the Digital Uzbekistan 2030 strategy aims to turn the country into a regional information-technology hub with higher technology exports and large-scale job creation.</w:t>
+        <w:t>Uzbekistan illustrates both the opportunity and the constraint. SMEs are central to the economy: World Bank country updates (2025) report that micro, small and medium-sized enterprises account for over ninety per cent of businesses, about seventy-five per cent of employment and roughly fifty-five per cent of gross domestic product, and the national statistics authorities record more than 1.2 million small businesses in early 2025. Connectivity and e-commerce have grown quickly from a low base; the World Bank (2023) reports that the e-commerce market expanded roughly fivefold between 2018 and 2022, exceeding half a billion United States dollars by 2023.</w:t>
       </w:r>
     </w:p>
     <w:p>
@@ -1281,7 +1328,39 @@
           <w:i w:val="0"/>
           <w:sz w:val="28"/>
         </w:rPr>
-        <w:t>The deeper transformation of enterprises nonetheless lags the roll-out of infrastructure. Preliminary figures presented at a UNESCAP (2025) foresight workshop suggest that only about ten per cent of SMEs were registered on the national digital public-services portal, an indication that the uptake of even basic digital government services — let alone analytics or artificial intelligence — remains shallow; this single figure is treated as indicative and would benefit from confirmation in firm-level survey data. Viewed through the lens of the framework, Uzbek SMEs increasingly possess the drivers and the connectivity but not yet the capability — skills, finance and managerial capacity — that converts adoption into performance. Table 2 summarises the regional and Uzbekistan indicators.</w:t>
+        <w:t>National policy is organised around the Digital Uzbekistan 2030 strategy. Its principal lines of action are the build-out of digital infrastructure, the expansion of the information-technology sector and the digitalisation of public services. On the supply side, IT Park Uzbekistan, established in 2019, hosts a large and growing community of resident technology companies and anchors the strategy’s targets of substantially higher technology exports and large-scale job creation, supported by sizeable public investment in infrastructure (World Bank, 2023). On the public-services side, a unified digital-government portal and the my.gov.uz interactive services consolidate tax, statistical and licensing procedures in a single-window form intended to lower the transaction costs SMEs face. The OECD (2023a) assessment of digital skills for private-sector competitiveness in Uzbekistan documents the complementary skills agenda this requires.</w:t>
+      </w:r>
+    </w:p>
+    <w:p>
+      <w:pPr>
+        <w:spacing w:line="360" w:lineRule="auto" w:after="120" w:before="0"/>
+        <w:ind w:firstLine="432"/>
+        <w:jc w:val="both"/>
+      </w:pPr>
+      <w:r>
+        <w:rPr>
+          <w:rFonts w:ascii="Times New Roman" w:hAnsi="Times New Roman" w:eastAsia="Times New Roman"/>
+          <w:b w:val="0"/>
+          <w:i w:val="0"/>
+          <w:sz w:val="28"/>
+        </w:rPr>
+        <w:t>The deeper transformation of enterprises nonetheless lags the roll-out of infrastructure, and the binding constraints are those the framework predicts. Coverage and quality of connectivity remain uneven between urban and rural areas; managerial and technical skills are scarce; access to finance for technology investment is limited; and the regulatory environment for the digital economy is still maturing (OECD, 2023a; World Bank, 2023). Preliminary figures presented at a UNESCAP (2025) foresight workshop suggest that only about ten per cent of SMEs were registered on the national digital public-services portal, an indication that the uptake of even basic digital government services — let alone analytics or artificial intelligence — remains shallow; this single figure is treated as indicative and would benefit from confirmation in firm-level survey data. Viewed through the lens of the framework, Uzbek SMEs increasingly possess the drivers and the connectivity but not yet the capability — skills, finance and managerial capacity — that converts adoption into performance.</w:t>
+      </w:r>
+    </w:p>
+    <w:p>
+      <w:pPr>
+        <w:spacing w:line="360" w:lineRule="auto" w:after="120" w:before="0"/>
+        <w:ind w:firstLine="432"/>
+        <w:jc w:val="both"/>
+      </w:pPr>
+      <w:r>
+        <w:rPr>
+          <w:rFonts w:ascii="Times New Roman" w:hAnsi="Times New Roman" w:eastAsia="Times New Roman"/>
+          <w:b w:val="0"/>
+          <w:i w:val="0"/>
+          <w:sz w:val="28"/>
+        </w:rPr>
+        <w:t>A brief comparison with Kazakhstan sharpens the point. Kazakhstan launched its Digital Kazakhstan programme earlier, in 2017, and the OECD (2023b) review of framework conditions for the digital transformation of businesses there finds that, even with more mature digital infrastructure and e-government, the digitalisation of smaller firms still turns on managerial capability, skills and the regulatory and financing environment rather than on connectivity alone. The two Central Asian cases thus point in the same direction as the ASEAN evidence: infrastructure and policy ambition advance first, and the capability to convert them into firm-level performance follows more slowly. Table 2 summarises the regional, Uzbekistan and Kazakhstan indicators.</w:t>
       </w:r>
     </w:p>
     <w:p>
@@ -1311,7 +1390,7 @@
           <w:i w:val="0"/>
           <w:sz w:val="24"/>
         </w:rPr>
-        <w:t>Digital transformation of SMEs in emerging Asia: selected secondary indicators</w:t>
+        <w:t>Digital transformation of SMEs in ASEAN and Central Asia: selected secondary indicators</w:t>
       </w:r>
     </w:p>
     <w:tbl>
@@ -1637,6 +1716,65 @@
                 <w:i w:val="0"/>
                 <w:sz w:val="24"/>
               </w:rPr>
+              <w:t>Uzbekistan – digital strategy</w:t>
+            </w:r>
+          </w:p>
+        </w:tc>
+        <w:tc>
+          <w:tcPr>
+            <w:tcW w:type="dxa" w:w="2947"/>
+          </w:tcPr>
+          <w:p>
+            <w:pPr>
+              <w:jc w:val="left"/>
+            </w:pPr>
+            <w:r>
+              <w:rPr>
+                <w:rFonts w:ascii="Times New Roman" w:hAnsi="Times New Roman" w:eastAsia="Times New Roman"/>
+                <w:b w:val="0"/>
+                <w:i w:val="0"/>
+                <w:sz w:val="24"/>
+              </w:rPr>
+              <w:t>Digital Uzbekistan 2030; IT Park (est. 2019)</w:t>
+            </w:r>
+          </w:p>
+        </w:tc>
+        <w:tc>
+          <w:tcPr>
+            <w:tcW w:type="dxa" w:w="2947"/>
+          </w:tcPr>
+          <w:p>
+            <w:pPr>
+              <w:jc w:val="left"/>
+            </w:pPr>
+            <w:r>
+              <w:rPr>
+                <w:rFonts w:ascii="Times New Roman" w:hAnsi="Times New Roman" w:eastAsia="Times New Roman"/>
+                <w:b w:val="0"/>
+                <w:i w:val="0"/>
+                <w:sz w:val="24"/>
+              </w:rPr>
+              <w:t>World Bank (2023); OECD (2023a)</w:t>
+            </w:r>
+          </w:p>
+        </w:tc>
+      </w:tr>
+      <w:tr>
+        <w:tc>
+          <w:tcPr>
+            <w:tcW w:type="dxa" w:w="2947"/>
+          </w:tcPr>
+          <w:p>
+            <w:pPr>
+              <w:jc w:val="left"/>
+            </w:pPr>
+            <w:r>
+              <w:rPr>
+                <w:rFonts w:ascii="Times New Roman" w:hAnsi="Times New Roman" w:eastAsia="Times New Roman"/>
+                <w:b w:val="0"/>
+                <w:i w:val="0"/>
+                <w:sz w:val="24"/>
+              </w:rPr>
               <w:t>Uzbekistan – SMEs on e-gov portal</w:t>
             </w:r>
           </w:p>
@@ -1676,6 +1814,65 @@
                 <w:sz w:val="24"/>
               </w:rPr>
               <w:t>UNESCAP (2025)</w:t>
+            </w:r>
+          </w:p>
+        </w:tc>
+      </w:tr>
+      <w:tr>
+        <w:tc>
+          <w:tcPr>
+            <w:tcW w:type="dxa" w:w="2947"/>
+          </w:tcPr>
+          <w:p>
+            <w:pPr>
+              <w:jc w:val="left"/>
+            </w:pPr>
+            <w:r>
+              <w:rPr>
+                <w:rFonts w:ascii="Times New Roman" w:hAnsi="Times New Roman" w:eastAsia="Times New Roman"/>
+                <w:b w:val="0"/>
+                <w:i w:val="0"/>
+                <w:sz w:val="24"/>
+              </w:rPr>
+              <w:t>Kazakhstan – digital strategy</w:t>
+            </w:r>
+          </w:p>
+        </w:tc>
+        <w:tc>
+          <w:tcPr>
+            <w:tcW w:type="dxa" w:w="2947"/>
+          </w:tcPr>
+          <w:p>
+            <w:pPr>
+              <w:jc w:val="left"/>
+            </w:pPr>
+            <w:r>
+              <w:rPr>
+                <w:rFonts w:ascii="Times New Roman" w:hAnsi="Times New Roman" w:eastAsia="Times New Roman"/>
+                <w:b w:val="0"/>
+                <w:i w:val="0"/>
+                <w:sz w:val="24"/>
+              </w:rPr>
+              <w:t>Digital Kazakhstan (since 2017); capability the constraint</w:t>
+            </w:r>
+          </w:p>
+        </w:tc>
+        <w:tc>
+          <w:tcPr>
+            <w:tcW w:type="dxa" w:w="2947"/>
+          </w:tcPr>
+          <w:p>
+            <w:pPr>
+              <w:jc w:val="left"/>
+            </w:pPr>
+            <w:r>
+              <w:rPr>
+                <w:rFonts w:ascii="Times New Roman" w:hAnsi="Times New Roman" w:eastAsia="Times New Roman"/>
+                <w:b w:val="0"/>
+                <w:i w:val="0"/>
+                <w:sz w:val="24"/>
+              </w:rPr>
+              <w:t>OECD (2023b)</w:t>
             </w:r>
           </w:p>
         </w:tc>
@@ -1820,6 +2017,211 @@
     </w:p>
     <w:p>
       <w:pPr>
+        <w:spacing w:line="360" w:lineRule="auto" w:after="80" w:before="160"/>
+        <w:jc w:val="both"/>
+      </w:pPr>
+      <w:r>
+        <w:rPr>
+          <w:rFonts w:ascii="Times New Roman" w:hAnsi="Times New Roman" w:eastAsia="Times New Roman"/>
+          <w:b/>
+          <w:i/>
+          <w:sz w:val="28"/>
+        </w:rPr>
+        <w:t>5.1. How to compute the capability-threshold diagnostic</w:t>
+      </w:r>
+    </w:p>
+    <w:p>
+      <w:pPr>
+        <w:spacing w:line="360" w:lineRule="auto" w:after="120" w:before="0"/>
+        <w:ind w:firstLine="432"/>
+        <w:jc w:val="both"/>
+      </w:pPr>
+      <w:r>
+        <w:rPr>
+          <w:rFonts w:ascii="Times New Roman" w:hAnsi="Times New Roman" w:eastAsia="Times New Roman"/>
+          <w:b w:val="0"/>
+          <w:i w:val="0"/>
+          <w:sz w:val="28"/>
+        </w:rPr>
+        <w:t>The capability-threshold diagnostic is computed in four steps. (i) Estimate equation (3) on the available SME sample to obtain β₁ and β₃. (ii) Recall that the marginal return to adoption is ∂ΔP/∂DTI = β₁ + β₃·C, so the threshold capability at which an extra unit of adoption begins to pay off (the marginal return turns positive) is C̄ = −β₁ / β₃ when β₁ &lt; 0 and β₃ &gt; 0. (iii) Compute the average capability of the SME population from the Kump et al. (2019) scale or its proxies and compare it with C̄. (iv) Read off the policy implication: if the population average lies below C̄, the marginal currency unit is better spent raising capability (skills, advisory services) than subsidising further hardware, and vice versa. Because C̄ depends on estimated coefficients, it should be reported with a confidence interval and re-estimated as data accumulate.</w:t>
+      </w:r>
+    </w:p>
+    <w:p>
+      <w:pPr>
+        <w:spacing w:line="360" w:lineRule="auto" w:after="80" w:before="160"/>
+        <w:jc w:val="both"/>
+      </w:pPr>
+      <w:r>
+        <w:rPr>
+          <w:rFonts w:ascii="Times New Roman" w:hAnsi="Times New Roman" w:eastAsia="Times New Roman"/>
+          <w:b/>
+          <w:i/>
+          <w:sz w:val="28"/>
+        </w:rPr>
+        <w:t>5.2. Checklist for SME managers</w:t>
+      </w:r>
+    </w:p>
+    <w:p>
+      <w:pPr>
+        <w:spacing w:line="360" w:lineRule="auto" w:after="120" w:before="0"/>
+        <w:ind w:firstLine="432"/>
+        <w:jc w:val="both"/>
+      </w:pPr>
+      <w:r>
+        <w:rPr>
+          <w:rFonts w:ascii="Times New Roman" w:hAnsi="Times New Roman" w:eastAsia="Times New Roman"/>
+          <w:b w:val="0"/>
+          <w:i w:val="0"/>
+          <w:sz w:val="28"/>
+        </w:rPr>
+        <w:t>□ Compute the firm’s current digital-transformation intensity (DTI) on a 0–1 scale from the adoption items in Section 2.1.</w:t>
+      </w:r>
+    </w:p>
+    <w:p>
+      <w:pPr>
+        <w:spacing w:line="360" w:lineRule="auto" w:after="120" w:before="0"/>
+        <w:ind w:firstLine="432"/>
+        <w:jc w:val="both"/>
+      </w:pPr>
+      <w:r>
+        <w:rPr>
+          <w:rFonts w:ascii="Times New Roman" w:hAnsi="Times New Roman" w:eastAsia="Times New Roman"/>
+          <w:b w:val="0"/>
+          <w:i w:val="0"/>
+          <w:sz w:val="28"/>
+        </w:rPr>
+        <w:t>□ Assess current capability (C) across sensing, seizing and transforming using the Kump et al. (2019) items or the observable proxies (digital skills, a written digital strategy, prior technology projects, staff training).</w:t>
+      </w:r>
+    </w:p>
+    <w:p>
+      <w:pPr>
+        <w:spacing w:line="360" w:lineRule="auto" w:after="120" w:before="0"/>
+        <w:ind w:firstLine="432"/>
+        <w:jc w:val="both"/>
+      </w:pPr>
+      <w:r>
+        <w:rPr>
+          <w:rFonts w:ascii="Times New Roman" w:hAnsi="Times New Roman" w:eastAsia="Times New Roman"/>
+          <w:b w:val="0"/>
+          <w:i w:val="0"/>
+          <w:sz w:val="28"/>
+        </w:rPr>
+        <w:t>□ If C is low (below about 0.5): invest first in skills and training, appoint a decision-owner for digitalisation, and start with foundational tools — a business website, professional e-mail, digital payments and cloud-based accounting — before moving further.</w:t>
+      </w:r>
+    </w:p>
+    <w:p>
+      <w:pPr>
+        <w:spacing w:line="360" w:lineRule="auto" w:after="120" w:before="0"/>
+        <w:ind w:firstLine="432"/>
+        <w:jc w:val="both"/>
+      </w:pPr>
+      <w:r>
+        <w:rPr>
+          <w:rFonts w:ascii="Times New Roman" w:hAnsi="Times New Roman" w:eastAsia="Times New Roman"/>
+          <w:b w:val="0"/>
+          <w:i w:val="0"/>
+          <w:sz w:val="28"/>
+        </w:rPr>
+        <w:t>□ If C is high (above about 0.5): advance to data analytics, integrated enterprise software and, where justified, artificial-intelligence tools, and use them to support business-model change rather than only to automate existing tasks.</w:t>
+      </w:r>
+    </w:p>
+    <w:p>
+      <w:pPr>
+        <w:spacing w:line="360" w:lineRule="auto" w:after="120" w:before="0"/>
+        <w:ind w:firstLine="432"/>
+        <w:jc w:val="both"/>
+      </w:pPr>
+      <w:r>
+        <w:rPr>
+          <w:rFonts w:ascii="Times New Roman" w:hAnsi="Times New Roman" w:eastAsia="Times New Roman"/>
+          <w:b w:val="0"/>
+          <w:i w:val="0"/>
+          <w:sz w:val="28"/>
+        </w:rPr>
+        <w:t>□ Advance one digital element at a time, raising DTI only as C rises, so that adoption and capability grow together (the capability-matched adoption rule).</w:t>
+      </w:r>
+    </w:p>
+    <w:p>
+      <w:pPr>
+        <w:spacing w:line="360" w:lineRule="auto" w:after="80" w:before="160"/>
+        <w:jc w:val="both"/>
+      </w:pPr>
+      <w:r>
+        <w:rPr>
+          <w:rFonts w:ascii="Times New Roman" w:hAnsi="Times New Roman" w:eastAsia="Times New Roman"/>
+          <w:b/>
+          <w:i/>
+          <w:sz w:val="28"/>
+        </w:rPr>
+        <w:t>5.3. Checklist for policymakers</w:t>
+      </w:r>
+    </w:p>
+    <w:p>
+      <w:pPr>
+        <w:spacing w:line="360" w:lineRule="auto" w:after="120" w:before="0"/>
+        <w:ind w:firstLine="432"/>
+        <w:jc w:val="both"/>
+      </w:pPr>
+      <w:r>
+        <w:rPr>
+          <w:rFonts w:ascii="Times New Roman" w:hAnsi="Times New Roman" w:eastAsia="Times New Roman"/>
+          <w:b w:val="0"/>
+          <w:i w:val="0"/>
+          <w:sz w:val="28"/>
+        </w:rPr>
+        <w:t>□ Estimate the average SME capability (C̄) for the country or sector from enterprise-survey data and compute the capability threshold as in Section 5.1.</w:t>
+      </w:r>
+    </w:p>
+    <w:p>
+      <w:pPr>
+        <w:spacing w:line="360" w:lineRule="auto" w:after="120" w:before="0"/>
+        <w:ind w:firstLine="432"/>
+        <w:jc w:val="both"/>
+      </w:pPr>
+      <w:r>
+        <w:rPr>
+          <w:rFonts w:ascii="Times New Roman" w:hAnsi="Times New Roman" w:eastAsia="Times New Roman"/>
+          <w:b w:val="0"/>
+          <w:i w:val="0"/>
+          <w:sz w:val="28"/>
+        </w:rPr>
+        <w:t>□ If average capability is low (below about 0.4): channel public support towards skills, advisory and diagnostic services, SME databases and credit-information systems that relax the finance constraint (Yoshino &amp; Taghizadeh-Hesary, 2016), rather than towards hardware subsidies.</w:t>
+      </w:r>
+    </w:p>
+    <w:p>
+      <w:pPr>
+        <w:spacing w:line="360" w:lineRule="auto" w:after="120" w:before="0"/>
+        <w:ind w:firstLine="432"/>
+        <w:jc w:val="both"/>
+      </w:pPr>
+      <w:r>
+        <w:rPr>
+          <w:rFonts w:ascii="Times New Roman" w:hAnsi="Times New Roman" w:eastAsia="Times New Roman"/>
+          <w:b w:val="0"/>
+          <w:i w:val="0"/>
+          <w:sz w:val="28"/>
+        </w:rPr>
+        <w:t>□ If average capability is higher (above about 0.6): shift support towards infrastructure, innovation and advanced-technology adoption, where the marginal return is now greater.</w:t>
+      </w:r>
+    </w:p>
+    <w:p>
+      <w:pPr>
+        <w:spacing w:line="360" w:lineRule="auto" w:after="120" w:before="0"/>
+        <w:ind w:firstLine="432"/>
+        <w:jc w:val="both"/>
+      </w:pPr>
+      <w:r>
+        <w:rPr>
+          <w:rFonts w:ascii="Times New Roman" w:hAnsi="Times New Roman" w:eastAsia="Times New Roman"/>
+          <w:b w:val="0"/>
+          <w:i w:val="0"/>
+          <w:sz w:val="28"/>
+        </w:rPr>
+        <w:t>□ In all cases, invest in shared digital public infrastructure — interoperable payments, digital identity and single-window e-government such as Uzbekistan’s my.gov.uz — which lowers the fixed cost of transformation for the smallest firms; and monitor SME digital uptake with firm-level surveys rather than infrastructure indicators alone.</w:t>
+      </w:r>
+    </w:p>
+    <w:p>
+      <w:pPr>
         <w:spacing w:line="360" w:lineRule="auto" w:after="120" w:before="200"/>
         <w:jc w:val="both"/>
       </w:pPr>
@@ -1846,7 +2248,7 @@
           <w:i w:val="0"/>
           <w:sz w:val="28"/>
         </w:rPr>
-        <w:t>Across emerging Asia, the firms that most need the productivity gains of digital technology — the small and medium-sized enterprises that dominate employment and output — are also those least equipped to realise them. This study argued that the decisive factor is not access to technology but the managerial capability to absorb it. Integrating the process view of digital transformation with the dynamic-capabilities perspective, it set out a framework linking external drivers, the firm’s sensing, seizing and reconfiguring capabilities, the depth of the transformation undertaken and the resulting performance, with a reinvestment feedback loop; it operationalised both digital-transformation intensity and dynamic capability using existing, validated instruments; and it expressed the core claim as a moderation hypothesis that can be estimated on firm-level data.</w:t>
+        <w:t>Across ASEAN and Central Asia, the firms that most need the productivity gains of digital technology — the small and medium-sized enterprises that dominate employment and output — are also those least equipped to realise them. This study argued that the decisive factor is not access to technology but the managerial capability to absorb it. Integrating the process view of digital transformation with the dynamic-capabilities perspective, it proposed a framework linking external drivers, the firm’s sensing, seizing and reconfiguring capabilities, the depth of the transformation undertaken and the resulting performance, with a reinvestment feedback loop; it operationalised both digital-transformation intensity and dynamic capability using existing, validated instruments; and it expressed the core claim as a single moderation hypothesis that can be estimated on firm-level data. Its distinct contribution is to combine an explicit capability-conditioned causal structure, an estimable interaction and a capability-threshold diagnostic, rather than to add another adoption index or another review.</w:t>
       </w:r>
     </w:p>
     <w:p>
@@ -1862,7 +2264,7 @@
           <w:i w:val="0"/>
           <w:sz w:val="28"/>
         </w:rPr>
-        <w:t>Assessed in light of secondary indicators from the ASEAN region and Uzbekistan, the framework is consistent with a clear pattern: connectivity and policy ambition advance quickly, but the capability to turn technology into performance — skills, finance and management — lags behind. The practical message for managers is to grow adoption and capability together; for policymakers, to use the capability-threshold diagnostic and to fund skills, finance and shared digital infrastructure rather than hardware alone. The study’s main limitation is that the moderation is specified and illustrated rather than estimated; the numerical example uses didactic inputs, not data. The clear next step is to estimate equation (3) on firm-level evidence — the World Bank Enterprise Surveys, including the 2024 Uzbekistan round, or a dedicated primary survey of Uzbek and ASEAN SMEs — which would quantify the interaction β₃ and the capability threshold and sharpen the policy priorities.</w:t>
+        <w:t>Assessed in light of secondary indicators from the ASEAN region, Uzbekistan and Kazakhstan, the framework is consistent with a clear pattern: connectivity and policy ambition advance quickly, but the capability to turn technology into performance — skills, finance and management — lags behind, a pattern that also conditions whether digital transformation supports the sustainability goals now linked to it (Mick et al., 2024; Lu &amp; Shaharudin, 2024). The practical message for managers is to grow adoption and capability together; for policymakers, to use the capability-threshold diagnostic and to fund skills, finance and shared digital infrastructure rather than hardware alone. The study’s main limitation is that the moderation is proposed and illustrated rather than estimated; the numerical example uses didactic inputs, not data. The clear next step is to estimate equation (3) on firm-level evidence — the World Bank Enterprise Surveys, including the 2024 Uzbekistan round, or a dedicated primary survey of Uzbek and ASEAN SMEs — which would quantify the interaction β₃ and the capability threshold and sharpen the policy priorities.</w:t>
       </w:r>
     </w:p>
     <w:p>
@@ -2021,6 +2423,38 @@
           <w:i w:val="0"/>
           <w:sz w:val="28"/>
         </w:rPr>
+        <w:t>Lu, Z., &amp; Shaharudin, M. S. (2024). Role of digital transformation for sustainable competitive advantage of SMEs: A systematic literature review. Cogent Business &amp; Management, 11(1), 2419489. https://doi.org/10.1080/23311975.2024.2419489</w:t>
+      </w:r>
+    </w:p>
+    <w:p>
+      <w:pPr>
+        <w:spacing w:line="360" w:lineRule="auto" w:after="80" w:before="0"/>
+        <w:ind w:left="720" w:hanging="720"/>
+        <w:jc w:val="both"/>
+      </w:pPr>
+      <w:r>
+        <w:rPr>
+          <w:rFonts w:ascii="Times New Roman" w:hAnsi="Times New Roman" w:eastAsia="Times New Roman"/>
+          <w:b w:val="0"/>
+          <w:i w:val="0"/>
+          <w:sz w:val="28"/>
+        </w:rPr>
+        <w:t>Mick, A. C., Kovaleski, J. L., &amp; Chiroli, D. M. de G. (2024). Sustainable digital transformation roadmaps for SMEs: A systematic literature review. Sustainability, 16(19), 8551. https://doi.org/10.3390/su16198551</w:t>
+      </w:r>
+    </w:p>
+    <w:p>
+      <w:pPr>
+        <w:spacing w:line="360" w:lineRule="auto" w:after="80" w:before="0"/>
+        <w:ind w:left="720" w:hanging="720"/>
+        <w:jc w:val="both"/>
+      </w:pPr>
+      <w:r>
+        <w:rPr>
+          <w:rFonts w:ascii="Times New Roman" w:hAnsi="Times New Roman" w:eastAsia="Times New Roman"/>
+          <w:b w:val="0"/>
+          <w:i w:val="0"/>
+          <w:sz w:val="28"/>
+        </w:rPr>
         <w:t>Nambisan, S., Wright, M., &amp; Feldman, M. (2019). The digital transformation of innovation and entrepreneurship: Progress, challenges and key themes. Research Policy, 48(8), 103773. https://doi.org/10.1016/j.respol.2019.03.018</w:t>
       </w:r>
     </w:p>
@@ -2037,7 +2471,55 @@
           <w:i w:val="0"/>
           <w:sz w:val="28"/>
         </w:rPr>
-        <w:t>OECD. (2021). The digital transformation of SMEs. Paris: OECD Publishing. https://doi.org/10.1787/bdb9256a-en</w:t>
+        <w:t>OECD. (2021a). The digital transformation of SMEs. Paris: OECD Publishing. https://doi.org/10.1787/bdb9256a-en</w:t>
+      </w:r>
+    </w:p>
+    <w:p>
+      <w:pPr>
+        <w:spacing w:line="360" w:lineRule="auto" w:after="80" w:before="0"/>
+        <w:ind w:left="720" w:hanging="720"/>
+        <w:jc w:val="both"/>
+      </w:pPr>
+      <w:r>
+        <w:rPr>
+          <w:rFonts w:ascii="Times New Roman" w:hAnsi="Times New Roman" w:eastAsia="Times New Roman"/>
+          <w:b w:val="0"/>
+          <w:i w:val="0"/>
+          <w:sz w:val="28"/>
+        </w:rPr>
+        <w:t>OECD. (2021b). Beyond COVID-19: Prospects for economic recovery in Central Asia. Paris: OECD Publishing. https://doi.org/10.1787/03882e7b-en</w:t>
+      </w:r>
+    </w:p>
+    <w:p>
+      <w:pPr>
+        <w:spacing w:line="360" w:lineRule="auto" w:after="80" w:before="0"/>
+        <w:ind w:left="720" w:hanging="720"/>
+        <w:jc w:val="both"/>
+      </w:pPr>
+      <w:r>
+        <w:rPr>
+          <w:rFonts w:ascii="Times New Roman" w:hAnsi="Times New Roman" w:eastAsia="Times New Roman"/>
+          <w:b w:val="0"/>
+          <w:i w:val="0"/>
+          <w:sz w:val="28"/>
+        </w:rPr>
+        <w:t>OECD. (2023a). Digital skills for private sector competitiveness in Uzbekistan. Paris: OECD Publishing. https://doi.org/10.1787/6c54f447-en</w:t>
+      </w:r>
+    </w:p>
+    <w:p>
+      <w:pPr>
+        <w:spacing w:line="360" w:lineRule="auto" w:after="80" w:before="0"/>
+        <w:ind w:left="720" w:hanging="720"/>
+        <w:jc w:val="both"/>
+      </w:pPr>
+      <w:r>
+        <w:rPr>
+          <w:rFonts w:ascii="Times New Roman" w:hAnsi="Times New Roman" w:eastAsia="Times New Roman"/>
+          <w:b w:val="0"/>
+          <w:i w:val="0"/>
+          <w:sz w:val="28"/>
+        </w:rPr>
+        <w:t>OECD. (2023b). Improving framework conditions for the digital transformation of businesses in Kazakhstan. Paris: OECD Publishing. https://doi.org/10.1787/368d4d01-en</w:t>
       </w:r>
     </w:p>
     <w:p>

</xml_diff>